<commit_message>
docs(pages): republica dossie 40 artigos sem azul e com numeracao corrigida
</commit_message>
<xml_diff>
--- a/premium-artigos-novembro/aprovacao-40-artigos-novembro-2026.docx
+++ b/premium-artigos-novembro/aprovacao-40-artigos-novembro-2026.docx
@@ -126,10 +126,18 @@
     </w:p>
     <w:tbl>
       <w:tblPr>
-        <w:tblStyle w:val="LightGrid-Accent1"/>
+        <w:tblStyle w:val="TableGrid"/>
         <w:tblW w:type="auto" w:w="0"/>
         <w:jc w:val="center"/>
         <w:tblLook w:firstColumn="1" w:firstRow="1" w:lastColumn="0" w:lastRow="0" w:noHBand="0" w:noVBand="1" w:val="04A0"/>
+        <w:tblBorders>
+          <w:top w:val="single" w:sz="4" w:space="0" w:color="DED7C8"/>
+          <w:left w:val="single" w:sz="4" w:space="0" w:color="DED7C8"/>
+          <w:bottom w:val="single" w:sz="4" w:space="0" w:color="DED7C8"/>
+          <w:right w:val="single" w:sz="4" w:space="0" w:color="DED7C8"/>
+          <w:insideH w:val="single" w:sz="4" w:space="0" w:color="DED7C8"/>
+          <w:insideV w:val="single" w:sz="4" w:space="0" w:color="DED7C8"/>
+        </w:tblBorders>
       </w:tblPr>
       <w:tblGrid>
         <w:gridCol w:w="3173"/>
@@ -365,9 +373,17 @@
     </w:p>
     <w:tbl>
       <w:tblPr>
-        <w:tblStyle w:val="LightGrid-Accent1"/>
+        <w:tblStyle w:val="TableGrid"/>
         <w:tblW w:type="auto" w:w="0"/>
         <w:tblLook w:firstColumn="1" w:firstRow="1" w:lastColumn="0" w:lastRow="0" w:noHBand="0" w:noVBand="1" w:val="04A0"/>
+        <w:tblBorders>
+          <w:top w:val="single" w:sz="4" w:space="0" w:color="DED7C8"/>
+          <w:left w:val="single" w:sz="4" w:space="0" w:color="DED7C8"/>
+          <w:bottom w:val="single" w:sz="4" w:space="0" w:color="DED7C8"/>
+          <w:right w:val="single" w:sz="4" w:space="0" w:color="DED7C8"/>
+          <w:insideH w:val="single" w:sz="4" w:space="0" w:color="DED7C8"/>
+          <w:insideV w:val="single" w:sz="4" w:space="0" w:color="DED7C8"/>
+        </w:tblBorders>
       </w:tblPr>
       <w:tblGrid>
         <w:gridCol w:w="2379"/>
@@ -779,9 +795,17 @@
     </w:p>
     <w:tbl>
       <w:tblPr>
-        <w:tblStyle w:val="LightGrid-Accent1"/>
+        <w:tblStyle w:val="TableGrid"/>
         <w:tblW w:type="auto" w:w="0"/>
         <w:tblLook w:firstColumn="1" w:firstRow="1" w:lastColumn="0" w:lastRow="0" w:noHBand="0" w:noVBand="1" w:val="04A0"/>
+        <w:tblBorders>
+          <w:top w:val="single" w:sz="4" w:space="0" w:color="DED7C8"/>
+          <w:left w:val="single" w:sz="4" w:space="0" w:color="DED7C8"/>
+          <w:bottom w:val="single" w:sz="4" w:space="0" w:color="DED7C8"/>
+          <w:right w:val="single" w:sz="4" w:space="0" w:color="DED7C8"/>
+          <w:insideH w:val="single" w:sz="4" w:space="0" w:color="DED7C8"/>
+          <w:insideV w:val="single" w:sz="4" w:space="0" w:color="DED7C8"/>
+        </w:tblBorders>
       </w:tblPr>
       <w:tblGrid>
         <w:gridCol w:w="2379"/>
@@ -1193,9 +1217,17 @@
     </w:p>
     <w:tbl>
       <w:tblPr>
-        <w:tblStyle w:val="LightGrid-Accent1"/>
+        <w:tblStyle w:val="TableGrid"/>
         <w:tblW w:type="auto" w:w="0"/>
         <w:tblLook w:firstColumn="1" w:firstRow="1" w:lastColumn="0" w:lastRow="0" w:noHBand="0" w:noVBand="1" w:val="04A0"/>
+        <w:tblBorders>
+          <w:top w:val="single" w:sz="4" w:space="0" w:color="DED7C8"/>
+          <w:left w:val="single" w:sz="4" w:space="0" w:color="DED7C8"/>
+          <w:bottom w:val="single" w:sz="4" w:space="0" w:color="DED7C8"/>
+          <w:right w:val="single" w:sz="4" w:space="0" w:color="DED7C8"/>
+          <w:insideH w:val="single" w:sz="4" w:space="0" w:color="DED7C8"/>
+          <w:insideV w:val="single" w:sz="4" w:space="0" w:color="DED7C8"/>
+        </w:tblBorders>
       </w:tblPr>
       <w:tblGrid>
         <w:gridCol w:w="2379"/>
@@ -1609,9 +1641,17 @@
     </w:p>
     <w:tbl>
       <w:tblPr>
-        <w:tblStyle w:val="LightGrid-Accent1"/>
+        <w:tblStyle w:val="TableGrid"/>
         <w:tblW w:type="auto" w:w="0"/>
         <w:tblLook w:firstColumn="1" w:firstRow="1" w:lastColumn="0" w:lastRow="0" w:noHBand="0" w:noVBand="1" w:val="04A0"/>
+        <w:tblBorders>
+          <w:top w:val="single" w:sz="4" w:space="0" w:color="DED7C8"/>
+          <w:left w:val="single" w:sz="4" w:space="0" w:color="DED7C8"/>
+          <w:bottom w:val="single" w:sz="4" w:space="0" w:color="DED7C8"/>
+          <w:right w:val="single" w:sz="4" w:space="0" w:color="DED7C8"/>
+          <w:insideH w:val="single" w:sz="4" w:space="0" w:color="DED7C8"/>
+          <w:insideV w:val="single" w:sz="4" w:space="0" w:color="DED7C8"/>
+        </w:tblBorders>
       </w:tblPr>
       <w:tblGrid>
         <w:gridCol w:w="2379"/>
@@ -2025,9 +2065,17 @@
     </w:p>
     <w:tbl>
       <w:tblPr>
-        <w:tblStyle w:val="LightGrid-Accent1"/>
+        <w:tblStyle w:val="TableGrid"/>
         <w:tblW w:type="auto" w:w="0"/>
         <w:tblLook w:firstColumn="1" w:firstRow="1" w:lastColumn="0" w:lastRow="0" w:noHBand="0" w:noVBand="1" w:val="04A0"/>
+        <w:tblBorders>
+          <w:top w:val="single" w:sz="4" w:space="0" w:color="DED7C8"/>
+          <w:left w:val="single" w:sz="4" w:space="0" w:color="DED7C8"/>
+          <w:bottom w:val="single" w:sz="4" w:space="0" w:color="DED7C8"/>
+          <w:right w:val="single" w:sz="4" w:space="0" w:color="DED7C8"/>
+          <w:insideH w:val="single" w:sz="4" w:space="0" w:color="DED7C8"/>
+          <w:insideV w:val="single" w:sz="4" w:space="0" w:color="DED7C8"/>
+        </w:tblBorders>
       </w:tblPr>
       <w:tblGrid>
         <w:gridCol w:w="2379"/>
@@ -2434,9 +2482,17 @@
     </w:p>
     <w:tbl>
       <w:tblPr>
-        <w:tblStyle w:val="LightGrid-Accent1"/>
+        <w:tblStyle w:val="TableGrid"/>
         <w:tblW w:type="auto" w:w="0"/>
         <w:tblLook w:firstColumn="1" w:firstRow="1" w:lastColumn="0" w:lastRow="0" w:noHBand="0" w:noVBand="1" w:val="04A0"/>
+        <w:tblBorders>
+          <w:top w:val="single" w:sz="4" w:space="0" w:color="DED7C8"/>
+          <w:left w:val="single" w:sz="4" w:space="0" w:color="DED7C8"/>
+          <w:bottom w:val="single" w:sz="4" w:space="0" w:color="DED7C8"/>
+          <w:right w:val="single" w:sz="4" w:space="0" w:color="DED7C8"/>
+          <w:insideH w:val="single" w:sz="4" w:space="0" w:color="DED7C8"/>
+          <w:insideV w:val="single" w:sz="4" w:space="0" w:color="DED7C8"/>
+        </w:tblBorders>
       </w:tblPr>
       <w:tblGrid>
         <w:gridCol w:w="4759"/>
@@ -3041,7 +3097,7 @@
       <w:bCs/>
       <w:i/>
       <w:iCs/>
-      <w:color w:val="4F81BD" w:themeColor="accent1"/>
+      <w:color w:val="1A1A1A" w:themeColor="accent1"/>
     </w:rPr>
   </w:style>
   <w:style w:type="paragraph" w:styleId="Heading5">
@@ -3062,7 +3118,7 @@
     </w:pPr>
     <w:rPr>
       <w:rFonts w:asciiTheme="majorHAnsi" w:eastAsiaTheme="majorEastAsia" w:hAnsiTheme="majorHAnsi" w:cstheme="majorBidi"/>
-      <w:color w:val="243F60" w:themeColor="accent1" w:themeShade="7F"/>
+      <w:color w:val="1A1A1A" w:themeColor="accent1" w:themeShade="7F"/>
     </w:rPr>
   </w:style>
   <w:style w:type="paragraph" w:styleId="Heading6">
@@ -3085,7 +3141,7 @@
       <w:rFonts w:asciiTheme="majorHAnsi" w:eastAsiaTheme="majorEastAsia" w:hAnsiTheme="majorHAnsi" w:cstheme="majorBidi"/>
       <w:i/>
       <w:iCs/>
-      <w:color w:val="243F60" w:themeColor="accent1" w:themeShade="7F"/>
+      <w:color w:val="1A1A1A" w:themeColor="accent1" w:themeShade="7F"/>
     </w:rPr>
   </w:style>
   <w:style w:type="paragraph" w:styleId="Heading7">
@@ -3129,7 +3185,7 @@
     </w:pPr>
     <w:rPr>
       <w:rFonts w:asciiTheme="majorHAnsi" w:eastAsiaTheme="majorEastAsia" w:hAnsiTheme="majorHAnsi" w:cstheme="majorBidi"/>
-      <w:color w:val="4F81BD" w:themeColor="accent1"/>
+      <w:color w:val="1A1A1A" w:themeColor="accent1"/>
       <w:sz w:val="20"/>
       <w:szCs w:val="20"/>
     </w:rPr>
@@ -3205,7 +3261,7 @@
       <w:rFonts w:asciiTheme="majorHAnsi" w:eastAsiaTheme="majorEastAsia" w:hAnsiTheme="majorHAnsi" w:cstheme="majorBidi"/>
       <w:b/>
       <w:bCs/>
-      <w:color w:val="365F91" w:themeColor="accent1" w:themeShade="BF"/>
+      <w:color w:val="1A1A1A" w:themeColor="accent1" w:themeShade="BF"/>
       <w:sz w:val="28"/>
       <w:szCs w:val="28"/>
     </w:rPr>
@@ -3220,7 +3276,7 @@
       <w:rFonts w:asciiTheme="majorHAnsi" w:eastAsiaTheme="majorEastAsia" w:hAnsiTheme="majorHAnsi" w:cstheme="majorBidi"/>
       <w:b/>
       <w:bCs/>
-      <w:color w:val="4F81BD" w:themeColor="accent1"/>
+      <w:color w:val="1A1A1A" w:themeColor="accent1"/>
       <w:sz w:val="26"/>
       <w:szCs w:val="26"/>
     </w:rPr>
@@ -3235,7 +3291,7 @@
       <w:rFonts w:asciiTheme="majorHAnsi" w:eastAsiaTheme="majorEastAsia" w:hAnsiTheme="majorHAnsi" w:cstheme="majorBidi"/>
       <w:b/>
       <w:bCs/>
-      <w:color w:val="4F81BD" w:themeColor="accent1"/>
+      <w:color w:val="1A1A1A" w:themeColor="accent1"/>
     </w:rPr>
   </w:style>
   <w:style w:type="paragraph" w:styleId="Title">
@@ -3255,7 +3311,7 @@
     </w:pPr>
     <w:rPr>
       <w:rFonts w:asciiTheme="majorHAnsi" w:eastAsiaTheme="majorEastAsia" w:hAnsiTheme="majorHAnsi" w:cstheme="majorBidi"/>
-      <w:color w:val="17365D" w:themeColor="text2" w:themeShade="BF"/>
+      <w:color w:val="1A1A1A" w:themeColor="text2" w:themeShade="BF"/>
       <w:spacing w:val="5"/>
       <w:kern w:val="28"/>
       <w:sz w:val="52"/>
@@ -3270,7 +3326,7 @@
     <w:rsid w:val="00FC693F"/>
     <w:rPr>
       <w:rFonts w:asciiTheme="majorHAnsi" w:eastAsiaTheme="majorEastAsia" w:hAnsiTheme="majorHAnsi" w:cstheme="majorBidi"/>
-      <w:color w:val="17365D" w:themeColor="text2" w:themeShade="BF"/>
+      <w:color w:val="1A1A1A" w:themeColor="text2" w:themeShade="BF"/>
       <w:spacing w:val="5"/>
       <w:kern w:val="28"/>
       <w:sz w:val="52"/>
@@ -3294,7 +3350,7 @@
       <w:rFonts w:asciiTheme="majorHAnsi" w:eastAsiaTheme="majorEastAsia" w:hAnsiTheme="majorHAnsi" w:cstheme="majorBidi"/>
       <w:i/>
       <w:iCs/>
-      <w:color w:val="4F81BD" w:themeColor="accent1"/>
+      <w:color w:val="1A1A1A" w:themeColor="accent1"/>
       <w:spacing w:val="15"/>
       <w:sz w:val="24"/>
       <w:szCs w:val="24"/>
@@ -3310,7 +3366,7 @@
       <w:rFonts w:asciiTheme="majorHAnsi" w:eastAsiaTheme="majorEastAsia" w:hAnsiTheme="majorHAnsi" w:cstheme="majorBidi"/>
       <w:i/>
       <w:iCs/>
-      <w:color w:val="4F81BD" w:themeColor="accent1"/>
+      <w:color w:val="1A1A1A" w:themeColor="accent1"/>
       <w:spacing w:val="15"/>
       <w:sz w:val="24"/>
       <w:szCs w:val="24"/>
@@ -3610,7 +3666,7 @@
       <w:bCs/>
       <w:i/>
       <w:iCs/>
-      <w:color w:val="4F81BD" w:themeColor="accent1"/>
+      <w:color w:val="1A1A1A" w:themeColor="accent1"/>
     </w:rPr>
   </w:style>
   <w:style w:type="character" w:customStyle="1" w:styleId="Heading5Char">
@@ -3622,7 +3678,7 @@
     <w:rsid w:val="00FC693F"/>
     <w:rPr>
       <w:rFonts w:asciiTheme="majorHAnsi" w:eastAsiaTheme="majorEastAsia" w:hAnsiTheme="majorHAnsi" w:cstheme="majorBidi"/>
-      <w:color w:val="243F60" w:themeColor="accent1" w:themeShade="7F"/>
+      <w:color w:val="1A1A1A" w:themeColor="accent1" w:themeShade="7F"/>
     </w:rPr>
   </w:style>
   <w:style w:type="character" w:customStyle="1" w:styleId="Heading6Char">
@@ -3636,7 +3692,7 @@
       <w:rFonts w:asciiTheme="majorHAnsi" w:eastAsiaTheme="majorEastAsia" w:hAnsiTheme="majorHAnsi" w:cstheme="majorBidi"/>
       <w:i/>
       <w:iCs/>
-      <w:color w:val="243F60" w:themeColor="accent1" w:themeShade="7F"/>
+      <w:color w:val="1A1A1A" w:themeColor="accent1" w:themeShade="7F"/>
     </w:rPr>
   </w:style>
   <w:style w:type="character" w:customStyle="1" w:styleId="Heading7Char">
@@ -3662,7 +3718,7 @@
     <w:rsid w:val="00FC693F"/>
     <w:rPr>
       <w:rFonts w:asciiTheme="majorHAnsi" w:eastAsiaTheme="majorEastAsia" w:hAnsiTheme="majorHAnsi" w:cstheme="majorBidi"/>
-      <w:color w:val="4F81BD" w:themeColor="accent1"/>
+      <w:color w:val="1A1A1A" w:themeColor="accent1"/>
       <w:sz w:val="20"/>
       <w:szCs w:val="20"/>
     </w:rPr>
@@ -3698,7 +3754,7 @@
     <w:rPr>
       <w:b/>
       <w:bCs/>
-      <w:color w:val="4F81BD" w:themeColor="accent1"/>
+      <w:color w:val="1A1A1A" w:themeColor="accent1"/>
       <w:sz w:val="18"/>
       <w:szCs w:val="18"/>
     </w:rPr>
@@ -3745,7 +3801,7 @@
       <w:bCs/>
       <w:i/>
       <w:iCs/>
-      <w:color w:val="4F81BD" w:themeColor="accent1"/>
+      <w:color w:val="1A1A1A" w:themeColor="accent1"/>
     </w:rPr>
   </w:style>
   <w:style w:type="character" w:customStyle="1" w:styleId="IntenseQuoteChar">
@@ -3759,7 +3815,7 @@
       <w:bCs/>
       <w:i/>
       <w:iCs/>
-      <w:color w:val="4F81BD" w:themeColor="accent1"/>
+      <w:color w:val="1A1A1A" w:themeColor="accent1"/>
     </w:rPr>
   </w:style>
   <w:style w:type="character" w:styleId="SubtleEmphasis">
@@ -3785,7 +3841,7 @@
       <w:bCs/>
       <w:i/>
       <w:iCs/>
-      <w:color w:val="4F81BD" w:themeColor="accent1"/>
+      <w:color w:val="1A1A1A" w:themeColor="accent1"/>
     </w:rPr>
   </w:style>
   <w:style w:type="character" w:styleId="SubtleReference">
@@ -3979,7 +4035,7 @@
       <w:spacing w:after="0" w:line="240" w:lineRule="auto"/>
     </w:pPr>
     <w:rPr>
-      <w:color w:val="365F91" w:themeColor="accent1" w:themeShade="BF"/>
+      <w:color w:val="1A1A1A" w:themeColor="accent1" w:themeShade="BF"/>
     </w:rPr>
     <w:tblPr>
       <w:tblStyleRowBandSize w:val="1"/>
@@ -4288,7 +4344,7 @@
       <w:spacing w:after="0" w:line="240" w:lineRule="auto"/>
     </w:pPr>
     <w:rPr>
-      <w:color w:val="5F497A" w:themeColor="accent4" w:themeShade="BF"/>
+      <w:color w:val="1A1A1A" w:themeColor="accent4" w:themeShade="BF"/>
     </w:rPr>
     <w:tblPr>
       <w:tblStyleRowBandSize w:val="1"/>
@@ -4391,7 +4447,7 @@
       <w:spacing w:after="0" w:line="240" w:lineRule="auto"/>
     </w:pPr>
     <w:rPr>
-      <w:color w:val="31849B" w:themeColor="accent5" w:themeShade="BF"/>
+      <w:color w:val="1A1A1A" w:themeColor="accent5" w:themeShade="BF"/>
     </w:rPr>
     <w:tblPr>
       <w:tblStyleRowBandSize w:val="1"/>
@@ -4716,7 +4772,7 @@
       </w:rPr>
       <w:tblPr/>
       <w:tcPr>
-        <w:shd w:val="clear" w:color="auto" w:fill="4F81BD" w:themeFill="accent1"/>
+        <w:shd w:val="clear" w:color="auto" w:fill="F5F0E6" w:themeFill="accent1"/>
       </w:tcPr>
     </w:tblStylePr>
     <w:tblStylePr w:type="lastRow">
@@ -4992,7 +5048,7 @@
       </w:rPr>
       <w:tblPr/>
       <w:tcPr>
-        <w:shd w:val="clear" w:color="auto" w:fill="8064A2" w:themeFill="accent4"/>
+        <w:shd w:val="clear" w:color="auto" w:fill="F5F0E6" w:themeFill="accent4"/>
       </w:tcPr>
     </w:tblStylePr>
     <w:tblStylePr w:type="lastRow">
@@ -5084,7 +5140,7 @@
       </w:rPr>
       <w:tblPr/>
       <w:tcPr>
-        <w:shd w:val="clear" w:color="auto" w:fill="4BACC6" w:themeFill="accent5"/>
+        <w:shd w:val="clear" w:color="auto" w:fill="F5F0E6" w:themeFill="accent5"/>
       </w:tcPr>
     </w:tblStylePr>
     <w:tblStylePr w:type="lastRow">
@@ -6293,7 +6349,7 @@
           <w:insideH w:val="nil"/>
           <w:insideV w:val="nil"/>
         </w:tcBorders>
-        <w:shd w:val="clear" w:color="auto" w:fill="4F81BD" w:themeFill="accent1"/>
+        <w:shd w:val="clear" w:color="auto" w:fill="F5F0E6" w:themeFill="accent1"/>
       </w:tcPr>
     </w:tblStylePr>
     <w:tblStylePr w:type="lastRow">
@@ -6611,7 +6667,7 @@
           <w:insideH w:val="nil"/>
           <w:insideV w:val="nil"/>
         </w:tcBorders>
-        <w:shd w:val="clear" w:color="auto" w:fill="8064A2" w:themeFill="accent4"/>
+        <w:shd w:val="clear" w:color="auto" w:fill="F5F0E6" w:themeFill="accent4"/>
       </w:tcPr>
     </w:tblStylePr>
     <w:tblStylePr w:type="lastRow">
@@ -6717,7 +6773,7 @@
           <w:insideH w:val="nil"/>
           <w:insideV w:val="nil"/>
         </w:tcBorders>
-        <w:shd w:val="clear" w:color="auto" w:fill="4BACC6" w:themeFill="accent5"/>
+        <w:shd w:val="clear" w:color="auto" w:fill="F5F0E6" w:themeFill="accent5"/>
       </w:tcPr>
     </w:tblStylePr>
     <w:tblStylePr w:type="lastRow">
@@ -7075,7 +7131,7 @@
           <w:insideH w:val="nil"/>
           <w:insideV w:val="nil"/>
         </w:tcBorders>
-        <w:shd w:val="clear" w:color="auto" w:fill="4F81BD" w:themeFill="accent1"/>
+        <w:shd w:val="clear" w:color="auto" w:fill="F5F0E6" w:themeFill="accent1"/>
       </w:tcPr>
     </w:tblStylePr>
     <w:tblStylePr w:type="lastRow">
@@ -7114,7 +7170,7 @@
           <w:insideH w:val="nil"/>
           <w:insideV w:val="nil"/>
         </w:tcBorders>
-        <w:shd w:val="clear" w:color="auto" w:fill="4F81BD" w:themeFill="accent1"/>
+        <w:shd w:val="clear" w:color="auto" w:fill="F5F0E6" w:themeFill="accent1"/>
       </w:tcPr>
     </w:tblStylePr>
     <w:tblStylePr w:type="lastCol">
@@ -7131,7 +7187,7 @@
           <w:insideH w:val="nil"/>
           <w:insideV w:val="nil"/>
         </w:tcBorders>
-        <w:shd w:val="clear" w:color="auto" w:fill="4F81BD" w:themeFill="accent1"/>
+        <w:shd w:val="clear" w:color="auto" w:fill="F5F0E6" w:themeFill="accent1"/>
       </w:tcPr>
     </w:tblStylePr>
     <w:tblStylePr w:type="band1Vert">
@@ -7522,7 +7578,7 @@
           <w:insideH w:val="nil"/>
           <w:insideV w:val="nil"/>
         </w:tcBorders>
-        <w:shd w:val="clear" w:color="auto" w:fill="8064A2" w:themeFill="accent4"/>
+        <w:shd w:val="clear" w:color="auto" w:fill="F5F0E6" w:themeFill="accent4"/>
       </w:tcPr>
     </w:tblStylePr>
     <w:tblStylePr w:type="lastRow">
@@ -7561,7 +7617,7 @@
           <w:insideH w:val="nil"/>
           <w:insideV w:val="nil"/>
         </w:tcBorders>
-        <w:shd w:val="clear" w:color="auto" w:fill="8064A2" w:themeFill="accent4"/>
+        <w:shd w:val="clear" w:color="auto" w:fill="F5F0E6" w:themeFill="accent4"/>
       </w:tcPr>
     </w:tblStylePr>
     <w:tblStylePr w:type="lastCol">
@@ -7578,7 +7634,7 @@
           <w:insideH w:val="nil"/>
           <w:insideV w:val="nil"/>
         </w:tcBorders>
-        <w:shd w:val="clear" w:color="auto" w:fill="8064A2" w:themeFill="accent4"/>
+        <w:shd w:val="clear" w:color="auto" w:fill="F5F0E6" w:themeFill="accent4"/>
       </w:tcPr>
     </w:tblStylePr>
     <w:tblStylePr w:type="band1Vert">
@@ -7671,7 +7727,7 @@
           <w:insideH w:val="nil"/>
           <w:insideV w:val="nil"/>
         </w:tcBorders>
-        <w:shd w:val="clear" w:color="auto" w:fill="4BACC6" w:themeFill="accent5"/>
+        <w:shd w:val="clear" w:color="auto" w:fill="F5F0E6" w:themeFill="accent5"/>
       </w:tcPr>
     </w:tblStylePr>
     <w:tblStylePr w:type="lastRow">
@@ -7710,7 +7766,7 @@
           <w:insideH w:val="nil"/>
           <w:insideV w:val="nil"/>
         </w:tcBorders>
-        <w:shd w:val="clear" w:color="auto" w:fill="4BACC6" w:themeFill="accent5"/>
+        <w:shd w:val="clear" w:color="auto" w:fill="F5F0E6" w:themeFill="accent5"/>
       </w:tcPr>
     </w:tblStylePr>
     <w:tblStylePr w:type="lastCol">
@@ -7727,7 +7783,7 @@
           <w:insideH w:val="nil"/>
           <w:insideV w:val="nil"/>
         </w:tcBorders>
-        <w:shd w:val="clear" w:color="auto" w:fill="4BACC6" w:themeFill="accent5"/>
+        <w:shd w:val="clear" w:color="auto" w:fill="F5F0E6" w:themeFill="accent5"/>
       </w:tcPr>
     </w:tblStylePr>
     <w:tblStylePr w:type="band1Vert">
@@ -7969,7 +8025,7 @@
       <w:rPr>
         <w:b/>
         <w:bCs/>
-        <w:color w:val="1F497D" w:themeColor="text2"/>
+        <w:color w:val="1A1A1A" w:themeColor="text2"/>
       </w:rPr>
       <w:tblPr/>
       <w:tcPr>
@@ -8053,7 +8109,7 @@
       <w:rPr>
         <w:b/>
         <w:bCs/>
-        <w:color w:val="1F497D" w:themeColor="text2"/>
+        <w:color w:val="1A1A1A" w:themeColor="text2"/>
       </w:rPr>
       <w:tblPr/>
       <w:tcPr>
@@ -8137,7 +8193,7 @@
       <w:rPr>
         <w:b/>
         <w:bCs/>
-        <w:color w:val="1F497D" w:themeColor="text2"/>
+        <w:color w:val="1A1A1A" w:themeColor="text2"/>
       </w:rPr>
       <w:tblPr/>
       <w:tcPr>
@@ -8221,7 +8277,7 @@
       <w:rPr>
         <w:b/>
         <w:bCs/>
-        <w:color w:val="1F497D" w:themeColor="text2"/>
+        <w:color w:val="1A1A1A" w:themeColor="text2"/>
       </w:rPr>
       <w:tblPr/>
       <w:tcPr>
@@ -8305,7 +8361,7 @@
       <w:rPr>
         <w:b/>
         <w:bCs/>
-        <w:color w:val="1F497D" w:themeColor="text2"/>
+        <w:color w:val="1A1A1A" w:themeColor="text2"/>
       </w:rPr>
       <w:tblPr/>
       <w:tcPr>
@@ -8389,7 +8445,7 @@
       <w:rPr>
         <w:b/>
         <w:bCs/>
-        <w:color w:val="1F497D" w:themeColor="text2"/>
+        <w:color w:val="1A1A1A" w:themeColor="text2"/>
       </w:rPr>
       <w:tblPr/>
       <w:tcPr>
@@ -8473,7 +8529,7 @@
       <w:rPr>
         <w:b/>
         <w:bCs/>
-        <w:color w:val="1F497D" w:themeColor="text2"/>
+        <w:color w:val="1A1A1A" w:themeColor="text2"/>
       </w:rPr>
       <w:tblPr/>
       <w:tcPr>
@@ -9547,13 +9603,13 @@
     <w:tblStylePr w:type="band1Vert">
       <w:tblPr/>
       <w:tcPr>
-        <w:shd w:val="clear" w:color="auto" w:fill="A7BFDE" w:themeFill="accent1" w:themeFillTint="7F"/>
+        <w:shd w:val="clear" w:color="auto" w:fill="F5F0E6" w:themeFill="accent1" w:themeFillTint="7F"/>
       </w:tcPr>
     </w:tblStylePr>
     <w:tblStylePr w:type="band1Horz">
       <w:tblPr/>
       <w:tcPr>
-        <w:shd w:val="clear" w:color="auto" w:fill="A7BFDE" w:themeFill="accent1" w:themeFillTint="7F"/>
+        <w:shd w:val="clear" w:color="auto" w:fill="F5F0E6" w:themeFill="accent1" w:themeFillTint="7F"/>
       </w:tcPr>
     </w:tblStylePr>
   </w:style>
@@ -10152,7 +10208,7 @@
     <w:tblStylePr w:type="band1Vert">
       <w:tblPr/>
       <w:tcPr>
-        <w:shd w:val="clear" w:color="auto" w:fill="A7BFDE" w:themeFill="accent1" w:themeFillTint="7F"/>
+        <w:shd w:val="clear" w:color="auto" w:fill="F5F0E6" w:themeFill="accent1" w:themeFillTint="7F"/>
       </w:tcPr>
     </w:tblStylePr>
     <w:tblStylePr w:type="band1Horz">
@@ -10162,7 +10218,7 @@
           <w:insideH w:val="single" w:sz="6" w:space="0" w:color="4F81BD" w:themeColor="accent1"/>
           <w:insideV w:val="single" w:sz="6" w:space="0" w:color="4F81BD" w:themeColor="accent1"/>
         </w:tcBorders>
-        <w:shd w:val="clear" w:color="auto" w:fill="A7BFDE" w:themeFill="accent1" w:themeFillTint="7F"/>
+        <w:shd w:val="clear" w:color="auto" w:fill="F5F0E6" w:themeFill="accent1" w:themeFillTint="7F"/>
       </w:tcPr>
     </w:tblStylePr>
     <w:tblStylePr w:type="nwCell">
@@ -10986,7 +11042,7 @@
           <w:insideH w:val="nil"/>
           <w:insideV w:val="single" w:sz="8" w:space="0" w:color="FFFFFF" w:themeColor="background1"/>
         </w:tcBorders>
-        <w:shd w:val="clear" w:color="auto" w:fill="4F81BD" w:themeFill="accent1"/>
+        <w:shd w:val="clear" w:color="auto" w:fill="F5F0E6" w:themeFill="accent1"/>
       </w:tcPr>
     </w:tblStylePr>
     <w:tblStylePr w:type="lastRow">
@@ -11007,7 +11063,7 @@
           <w:insideH w:val="nil"/>
           <w:insideV w:val="single" w:sz="8" w:space="0" w:color="FFFFFF" w:themeColor="background1"/>
         </w:tcBorders>
-        <w:shd w:val="clear" w:color="auto" w:fill="4F81BD" w:themeFill="accent1"/>
+        <w:shd w:val="clear" w:color="auto" w:fill="F5F0E6" w:themeFill="accent1"/>
       </w:tcPr>
     </w:tblStylePr>
     <w:tblStylePr w:type="firstCol">
@@ -11026,7 +11082,7 @@
           <w:insideH w:val="nil"/>
           <w:insideV w:val="nil"/>
         </w:tcBorders>
-        <w:shd w:val="clear" w:color="auto" w:fill="4F81BD" w:themeFill="accent1"/>
+        <w:shd w:val="clear" w:color="auto" w:fill="F5F0E6" w:themeFill="accent1"/>
       </w:tcPr>
     </w:tblStylePr>
     <w:tblStylePr w:type="lastCol">
@@ -11047,7 +11103,7 @@
           <w:insideH w:val="nil"/>
           <w:insideV w:val="nil"/>
         </w:tcBorders>
-        <w:shd w:val="clear" w:color="auto" w:fill="4F81BD" w:themeFill="accent1"/>
+        <w:shd w:val="clear" w:color="auto" w:fill="F5F0E6" w:themeFill="accent1"/>
       </w:tcPr>
     </w:tblStylePr>
     <w:tblStylePr w:type="band1Vert">
@@ -11061,7 +11117,7 @@
           <w:insideH w:val="nil"/>
           <w:insideV w:val="nil"/>
         </w:tcBorders>
-        <w:shd w:val="clear" w:color="auto" w:fill="A7BFDE" w:themeFill="accent1" w:themeFillTint="7F"/>
+        <w:shd w:val="clear" w:color="auto" w:fill="F5F0E6" w:themeFill="accent1" w:themeFillTint="7F"/>
       </w:tcPr>
     </w:tblStylePr>
     <w:tblStylePr w:type="band1Horz">
@@ -11075,7 +11131,7 @@
           <w:insideH w:val="single" w:sz="8" w:space="0" w:color="FFFFFF" w:themeColor="background1"/>
           <w:insideV w:val="single" w:sz="8" w:space="0" w:color="FFFFFF" w:themeColor="background1"/>
         </w:tcBorders>
-        <w:shd w:val="clear" w:color="auto" w:fill="A7BFDE" w:themeFill="accent1" w:themeFillTint="7F"/>
+        <w:shd w:val="clear" w:color="auto" w:fill="F5F0E6" w:themeFill="accent1" w:themeFillTint="7F"/>
       </w:tcPr>
     </w:tblStylePr>
   </w:style>
@@ -11409,7 +11465,7 @@
           <w:insideH w:val="nil"/>
           <w:insideV w:val="single" w:sz="8" w:space="0" w:color="FFFFFF" w:themeColor="background1"/>
         </w:tcBorders>
-        <w:shd w:val="clear" w:color="auto" w:fill="8064A2" w:themeFill="accent4"/>
+        <w:shd w:val="clear" w:color="auto" w:fill="F5F0E6" w:themeFill="accent4"/>
       </w:tcPr>
     </w:tblStylePr>
     <w:tblStylePr w:type="lastRow">
@@ -11430,7 +11486,7 @@
           <w:insideH w:val="nil"/>
           <w:insideV w:val="single" w:sz="8" w:space="0" w:color="FFFFFF" w:themeColor="background1"/>
         </w:tcBorders>
-        <w:shd w:val="clear" w:color="auto" w:fill="8064A2" w:themeFill="accent4"/>
+        <w:shd w:val="clear" w:color="auto" w:fill="F5F0E6" w:themeFill="accent4"/>
       </w:tcPr>
     </w:tblStylePr>
     <w:tblStylePr w:type="firstCol">
@@ -11449,7 +11505,7 @@
           <w:insideH w:val="nil"/>
           <w:insideV w:val="nil"/>
         </w:tcBorders>
-        <w:shd w:val="clear" w:color="auto" w:fill="8064A2" w:themeFill="accent4"/>
+        <w:shd w:val="clear" w:color="auto" w:fill="F5F0E6" w:themeFill="accent4"/>
       </w:tcPr>
     </w:tblStylePr>
     <w:tblStylePr w:type="lastCol">
@@ -11470,7 +11526,7 @@
           <w:insideH w:val="nil"/>
           <w:insideV w:val="nil"/>
         </w:tcBorders>
-        <w:shd w:val="clear" w:color="auto" w:fill="8064A2" w:themeFill="accent4"/>
+        <w:shd w:val="clear" w:color="auto" w:fill="F5F0E6" w:themeFill="accent4"/>
       </w:tcPr>
     </w:tblStylePr>
     <w:tblStylePr w:type="band1Vert">
@@ -11550,7 +11606,7 @@
           <w:insideH w:val="nil"/>
           <w:insideV w:val="single" w:sz="8" w:space="0" w:color="FFFFFF" w:themeColor="background1"/>
         </w:tcBorders>
-        <w:shd w:val="clear" w:color="auto" w:fill="4BACC6" w:themeFill="accent5"/>
+        <w:shd w:val="clear" w:color="auto" w:fill="F5F0E6" w:themeFill="accent5"/>
       </w:tcPr>
     </w:tblStylePr>
     <w:tblStylePr w:type="lastRow">
@@ -11571,7 +11627,7 @@
           <w:insideH w:val="nil"/>
           <w:insideV w:val="single" w:sz="8" w:space="0" w:color="FFFFFF" w:themeColor="background1"/>
         </w:tcBorders>
-        <w:shd w:val="clear" w:color="auto" w:fill="4BACC6" w:themeFill="accent5"/>
+        <w:shd w:val="clear" w:color="auto" w:fill="F5F0E6" w:themeFill="accent5"/>
       </w:tcPr>
     </w:tblStylePr>
     <w:tblStylePr w:type="firstCol">
@@ -11590,7 +11646,7 @@
           <w:insideH w:val="nil"/>
           <w:insideV w:val="nil"/>
         </w:tcBorders>
-        <w:shd w:val="clear" w:color="auto" w:fill="4BACC6" w:themeFill="accent5"/>
+        <w:shd w:val="clear" w:color="auto" w:fill="F5F0E6" w:themeFill="accent5"/>
       </w:tcPr>
     </w:tblStylePr>
     <w:tblStylePr w:type="lastCol">
@@ -11611,7 +11667,7 @@
           <w:insideH w:val="nil"/>
           <w:insideV w:val="nil"/>
         </w:tcBorders>
-        <w:shd w:val="clear" w:color="auto" w:fill="4BACC6" w:themeFill="accent5"/>
+        <w:shd w:val="clear" w:color="auto" w:fill="F5F0E6" w:themeFill="accent5"/>
       </w:tcPr>
     </w:tblStylePr>
     <w:tblStylePr w:type="band1Vert">
@@ -11921,7 +11977,7 @@
       </w:tblCellMar>
     </w:tblPr>
     <w:tcPr>
-      <w:shd w:val="clear" w:color="auto" w:fill="4F81BD" w:themeFill="accent1"/>
+      <w:shd w:val="clear" w:color="auto" w:fill="F5F0E6" w:themeFill="accent1"/>
     </w:tcPr>
     <w:tblStylePr w:type="firstRow">
       <w:rPr>
@@ -11952,7 +12008,7 @@
           <w:insideH w:val="nil"/>
           <w:insideV w:val="nil"/>
         </w:tcBorders>
-        <w:shd w:val="clear" w:color="auto" w:fill="243F60" w:themeFill="accent1" w:themeFillShade="7F"/>
+        <w:shd w:val="clear" w:color="auto" w:fill="F5F0E6" w:themeFill="accent1" w:themeFillShade="7F"/>
       </w:tcPr>
     </w:tblStylePr>
     <w:tblStylePr w:type="firstCol">
@@ -11966,7 +12022,7 @@
           <w:insideH w:val="nil"/>
           <w:insideV w:val="nil"/>
         </w:tcBorders>
-        <w:shd w:val="clear" w:color="auto" w:fill="365F91" w:themeFill="accent1" w:themeFillShade="BF"/>
+        <w:shd w:val="clear" w:color="auto" w:fill="F5F0E6" w:themeFill="accent1" w:themeFillShade="BF"/>
       </w:tcPr>
     </w:tblStylePr>
     <w:tblStylePr w:type="lastCol">
@@ -11980,7 +12036,7 @@
           <w:insideH w:val="nil"/>
           <w:insideV w:val="nil"/>
         </w:tcBorders>
-        <w:shd w:val="clear" w:color="auto" w:fill="365F91" w:themeFill="accent1" w:themeFillShade="BF"/>
+        <w:shd w:val="clear" w:color="auto" w:fill="F5F0E6" w:themeFill="accent1" w:themeFillShade="BF"/>
       </w:tcPr>
     </w:tblStylePr>
     <w:tblStylePr w:type="band1Vert">
@@ -11994,7 +12050,7 @@
           <w:insideH w:val="nil"/>
           <w:insideV w:val="nil"/>
         </w:tcBorders>
-        <w:shd w:val="clear" w:color="auto" w:fill="365F91" w:themeFill="accent1" w:themeFillShade="BF"/>
+        <w:shd w:val="clear" w:color="auto" w:fill="F5F0E6" w:themeFill="accent1" w:themeFillShade="BF"/>
       </w:tcPr>
     </w:tblStylePr>
     <w:tblStylePr w:type="band1Horz">
@@ -12008,7 +12064,7 @@
           <w:insideH w:val="nil"/>
           <w:insideV w:val="nil"/>
         </w:tcBorders>
-        <w:shd w:val="clear" w:color="auto" w:fill="365F91" w:themeFill="accent1" w:themeFillShade="BF"/>
+        <w:shd w:val="clear" w:color="auto" w:fill="F5F0E6" w:themeFill="accent1" w:themeFillShade="BF"/>
       </w:tcPr>
     </w:tblStylePr>
   </w:style>
@@ -12263,7 +12319,7 @@
       </w:tblCellMar>
     </w:tblPr>
     <w:tcPr>
-      <w:shd w:val="clear" w:color="auto" w:fill="8064A2" w:themeFill="accent4"/>
+      <w:shd w:val="clear" w:color="auto" w:fill="F5F0E6" w:themeFill="accent4"/>
     </w:tcPr>
     <w:tblStylePr w:type="firstRow">
       <w:rPr>
@@ -12308,7 +12364,7 @@
           <w:insideH w:val="nil"/>
           <w:insideV w:val="nil"/>
         </w:tcBorders>
-        <w:shd w:val="clear" w:color="auto" w:fill="5F497A" w:themeFill="accent4" w:themeFillShade="BF"/>
+        <w:shd w:val="clear" w:color="auto" w:fill="F5F0E6" w:themeFill="accent4" w:themeFillShade="BF"/>
       </w:tcPr>
     </w:tblStylePr>
     <w:tblStylePr w:type="lastCol">
@@ -12322,7 +12378,7 @@
           <w:insideH w:val="nil"/>
           <w:insideV w:val="nil"/>
         </w:tcBorders>
-        <w:shd w:val="clear" w:color="auto" w:fill="5F497A" w:themeFill="accent4" w:themeFillShade="BF"/>
+        <w:shd w:val="clear" w:color="auto" w:fill="F5F0E6" w:themeFill="accent4" w:themeFillShade="BF"/>
       </w:tcPr>
     </w:tblStylePr>
     <w:tblStylePr w:type="band1Vert">
@@ -12336,7 +12392,7 @@
           <w:insideH w:val="nil"/>
           <w:insideV w:val="nil"/>
         </w:tcBorders>
-        <w:shd w:val="clear" w:color="auto" w:fill="5F497A" w:themeFill="accent4" w:themeFillShade="BF"/>
+        <w:shd w:val="clear" w:color="auto" w:fill="F5F0E6" w:themeFill="accent4" w:themeFillShade="BF"/>
       </w:tcPr>
     </w:tblStylePr>
     <w:tblStylePr w:type="band1Horz">
@@ -12350,7 +12406,7 @@
           <w:insideH w:val="nil"/>
           <w:insideV w:val="nil"/>
         </w:tcBorders>
-        <w:shd w:val="clear" w:color="auto" w:fill="5F497A" w:themeFill="accent4" w:themeFillShade="BF"/>
+        <w:shd w:val="clear" w:color="auto" w:fill="F5F0E6" w:themeFill="accent4" w:themeFillShade="BF"/>
       </w:tcPr>
     </w:tblStylePr>
   </w:style>
@@ -12377,7 +12433,7 @@
       </w:tblCellMar>
     </w:tblPr>
     <w:tcPr>
-      <w:shd w:val="clear" w:color="auto" w:fill="4BACC6" w:themeFill="accent5"/>
+      <w:shd w:val="clear" w:color="auto" w:fill="F5F0E6" w:themeFill="accent5"/>
     </w:tcPr>
     <w:tblStylePr w:type="firstRow">
       <w:rPr>
@@ -12422,7 +12478,7 @@
           <w:insideH w:val="nil"/>
           <w:insideV w:val="nil"/>
         </w:tcBorders>
-        <w:shd w:val="clear" w:color="auto" w:fill="31849B" w:themeFill="accent5" w:themeFillShade="BF"/>
+        <w:shd w:val="clear" w:color="auto" w:fill="F5F0E6" w:themeFill="accent5" w:themeFillShade="BF"/>
       </w:tcPr>
     </w:tblStylePr>
     <w:tblStylePr w:type="lastCol">
@@ -12436,7 +12492,7 @@
           <w:insideH w:val="nil"/>
           <w:insideV w:val="nil"/>
         </w:tcBorders>
-        <w:shd w:val="clear" w:color="auto" w:fill="31849B" w:themeFill="accent5" w:themeFillShade="BF"/>
+        <w:shd w:val="clear" w:color="auto" w:fill="F5F0E6" w:themeFill="accent5" w:themeFillShade="BF"/>
       </w:tcPr>
     </w:tblStylePr>
     <w:tblStylePr w:type="band1Vert">
@@ -12450,7 +12506,7 @@
           <w:insideH w:val="nil"/>
           <w:insideV w:val="nil"/>
         </w:tcBorders>
-        <w:shd w:val="clear" w:color="auto" w:fill="31849B" w:themeFill="accent5" w:themeFillShade="BF"/>
+        <w:shd w:val="clear" w:color="auto" w:fill="F5F0E6" w:themeFill="accent5" w:themeFillShade="BF"/>
       </w:tcPr>
     </w:tblStylePr>
     <w:tblStylePr w:type="band1Horz">
@@ -12464,7 +12520,7 @@
           <w:insideH w:val="nil"/>
           <w:insideV w:val="nil"/>
         </w:tcBorders>
-        <w:shd w:val="clear" w:color="auto" w:fill="31849B" w:themeFill="accent5" w:themeFillShade="BF"/>
+        <w:shd w:val="clear" w:color="auto" w:fill="F5F0E6" w:themeFill="accent5" w:themeFillShade="BF"/>
       </w:tcPr>
     </w:tblStylePr>
   </w:style>
@@ -12766,7 +12822,7 @@
         <w:tcBorders>
           <w:top w:val="single" w:sz="6" w:space="0" w:color="FFFFFF" w:themeColor="background1"/>
         </w:tcBorders>
-        <w:shd w:val="clear" w:color="auto" w:fill="2C4C74" w:themeFill="accent1" w:themeFillShade="99"/>
+        <w:shd w:val="clear" w:color="auto" w:fill="F5F0E6" w:themeFill="accent1" w:themeFillShade="99"/>
       </w:tcPr>
     </w:tblStylePr>
     <w:tblStylePr w:type="firstCol">
@@ -12783,7 +12839,7 @@
           <w:insideH w:val="single" w:sz="4" w:space="0" w:color="2C4C74" w:themeColor="accent1" w:themeShade="99"/>
           <w:insideV w:val="nil"/>
         </w:tcBorders>
-        <w:shd w:val="clear" w:color="auto" w:fill="2C4C74" w:themeFill="accent1" w:themeFillShade="99"/>
+        <w:shd w:val="clear" w:color="auto" w:fill="F5F0E6" w:themeFill="accent1" w:themeFillShade="99"/>
       </w:tcPr>
     </w:tblStylePr>
     <w:tblStylePr w:type="lastCol">
@@ -12800,19 +12856,19 @@
           <w:insideH w:val="nil"/>
           <w:insideV w:val="nil"/>
         </w:tcBorders>
-        <w:shd w:val="clear" w:color="auto" w:fill="2C4C74" w:themeFill="accent1" w:themeFillShade="99"/>
+        <w:shd w:val="clear" w:color="auto" w:fill="F5F0E6" w:themeFill="accent1" w:themeFillShade="99"/>
       </w:tcPr>
     </w:tblStylePr>
     <w:tblStylePr w:type="band1Vert">
       <w:tblPr/>
       <w:tcPr>
-        <w:shd w:val="clear" w:color="auto" w:fill="B8CCE4" w:themeFill="accent1" w:themeFillTint="66"/>
+        <w:shd w:val="clear" w:color="auto" w:fill="F5F0E6" w:themeFill="accent1" w:themeFillTint="66"/>
       </w:tcPr>
     </w:tblStylePr>
     <w:tblStylePr w:type="band1Horz">
       <w:tblPr/>
       <w:tcPr>
-        <w:shd w:val="clear" w:color="auto" w:fill="A7BFDE" w:themeFill="accent1" w:themeFillTint="7F"/>
+        <w:shd w:val="clear" w:color="auto" w:fill="F5F0E6" w:themeFill="accent1" w:themeFillTint="7F"/>
       </w:tcPr>
     </w:tblStylePr>
     <w:tblStylePr w:type="neCell">
@@ -13244,7 +13300,7 @@
         <w:tcBorders>
           <w:top w:val="single" w:sz="6" w:space="0" w:color="FFFFFF" w:themeColor="background1"/>
         </w:tcBorders>
-        <w:shd w:val="clear" w:color="auto" w:fill="276A7C" w:themeFill="accent5" w:themeFillShade="99"/>
+        <w:shd w:val="clear" w:color="auto" w:fill="F5F0E6" w:themeFill="accent5" w:themeFillShade="99"/>
       </w:tcPr>
     </w:tblStylePr>
     <w:tblStylePr w:type="firstCol">
@@ -13261,7 +13317,7 @@
           <w:insideH w:val="single" w:sz="4" w:space="0" w:color="276A7C" w:themeColor="accent5" w:themeShade="99"/>
           <w:insideV w:val="nil"/>
         </w:tcBorders>
-        <w:shd w:val="clear" w:color="auto" w:fill="276A7C" w:themeFill="accent5" w:themeFillShade="99"/>
+        <w:shd w:val="clear" w:color="auto" w:fill="F5F0E6" w:themeFill="accent5" w:themeFillShade="99"/>
       </w:tcPr>
     </w:tblStylePr>
     <w:tblStylePr w:type="lastCol">
@@ -13278,7 +13334,7 @@
           <w:insideH w:val="nil"/>
           <w:insideV w:val="nil"/>
         </w:tcBorders>
-        <w:shd w:val="clear" w:color="auto" w:fill="276A7C" w:themeFill="accent5" w:themeFillShade="99"/>
+        <w:shd w:val="clear" w:color="auto" w:fill="F5F0E6" w:themeFill="accent5" w:themeFillShade="99"/>
       </w:tcPr>
     </w:tblStylePr>
     <w:tblStylePr w:type="band1Vert">
@@ -13720,14 +13776,14 @@
         <w:tcBorders>
           <w:bottom w:val="single" w:sz="12" w:space="0" w:color="FFFFFF" w:themeColor="background1"/>
         </w:tcBorders>
-        <w:shd w:val="clear" w:color="auto" w:fill="664E82" w:themeFill="accent4" w:themeFillShade="CC"/>
+        <w:shd w:val="clear" w:color="auto" w:fill="F5F0E6" w:themeFill="accent4" w:themeFillShade="CC"/>
       </w:tcPr>
     </w:tblStylePr>
     <w:tblStylePr w:type="lastRow">
       <w:rPr>
         <w:b/>
         <w:bCs/>
-        <w:color w:val="664E82" w:themeColor="accent4" w:themeShade="CC"/>
+        <w:color w:val="1A1A1A" w:themeColor="accent4" w:themeShade="CC"/>
       </w:rPr>
       <w:tblPr/>
       <w:tcPr>
@@ -13978,14 +14034,14 @@
         <w:tcBorders>
           <w:bottom w:val="single" w:sz="12" w:space="0" w:color="FFFFFF" w:themeColor="background1"/>
         </w:tcBorders>
-        <w:shd w:val="clear" w:color="auto" w:fill="348DA5" w:themeFill="accent5" w:themeFillShade="CC"/>
+        <w:shd w:val="clear" w:color="auto" w:fill="F5F0E6" w:themeFill="accent5" w:themeFillShade="CC"/>
       </w:tcPr>
     </w:tblStylePr>
     <w:tblStylePr w:type="lastRow">
       <w:rPr>
         <w:b/>
         <w:bCs/>
-        <w:color w:val="348DA5" w:themeColor="accent5" w:themeShade="CC"/>
+        <w:color w:val="1A1A1A" w:themeColor="accent5" w:themeShade="CC"/>
       </w:rPr>
       <w:tblPr/>
       <w:tcPr>
@@ -14143,7 +14199,7 @@
       </w:rPr>
       <w:tblPr/>
       <w:tcPr>
-        <w:shd w:val="clear" w:color="auto" w:fill="B8CCE4" w:themeFill="accent1" w:themeFillTint="66"/>
+        <w:shd w:val="clear" w:color="auto" w:fill="F5F0E6" w:themeFill="accent1" w:themeFillTint="66"/>
       </w:tcPr>
     </w:tblStylePr>
     <w:tblStylePr w:type="lastRow">
@@ -14154,7 +14210,7 @@
       </w:rPr>
       <w:tblPr/>
       <w:tcPr>
-        <w:shd w:val="clear" w:color="auto" w:fill="B8CCE4" w:themeFill="accent1" w:themeFillTint="66"/>
+        <w:shd w:val="clear" w:color="auto" w:fill="F5F0E6" w:themeFill="accent1" w:themeFillTint="66"/>
       </w:tcPr>
     </w:tblStylePr>
     <w:tblStylePr w:type="firstCol">
@@ -14163,7 +14219,7 @@
       </w:rPr>
       <w:tblPr/>
       <w:tcPr>
-        <w:shd w:val="clear" w:color="auto" w:fill="365F91" w:themeFill="accent1" w:themeFillShade="BF"/>
+        <w:shd w:val="clear" w:color="auto" w:fill="F5F0E6" w:themeFill="accent1" w:themeFillShade="BF"/>
       </w:tcPr>
     </w:tblStylePr>
     <w:tblStylePr w:type="lastCol">
@@ -14172,19 +14228,19 @@
       </w:rPr>
       <w:tblPr/>
       <w:tcPr>
-        <w:shd w:val="clear" w:color="auto" w:fill="365F91" w:themeFill="accent1" w:themeFillShade="BF"/>
+        <w:shd w:val="clear" w:color="auto" w:fill="F5F0E6" w:themeFill="accent1" w:themeFillShade="BF"/>
       </w:tcPr>
     </w:tblStylePr>
     <w:tblStylePr w:type="band1Vert">
       <w:tblPr/>
       <w:tcPr>
-        <w:shd w:val="clear" w:color="auto" w:fill="A7BFDE" w:themeFill="accent1" w:themeFillTint="7F"/>
+        <w:shd w:val="clear" w:color="auto" w:fill="F5F0E6" w:themeFill="accent1" w:themeFillTint="7F"/>
       </w:tcPr>
     </w:tblStylePr>
     <w:tblStylePr w:type="band1Horz">
       <w:tblPr/>
       <w:tcPr>
-        <w:shd w:val="clear" w:color="auto" w:fill="A7BFDE" w:themeFill="accent1" w:themeFillTint="7F"/>
+        <w:shd w:val="clear" w:color="auto" w:fill="F5F0E6" w:themeFill="accent1" w:themeFillTint="7F"/>
       </w:tcPr>
     </w:tblStylePr>
   </w:style>
@@ -14403,7 +14459,7 @@
       </w:rPr>
       <w:tblPr/>
       <w:tcPr>
-        <w:shd w:val="clear" w:color="auto" w:fill="5F497A" w:themeFill="accent4" w:themeFillShade="BF"/>
+        <w:shd w:val="clear" w:color="auto" w:fill="F5F0E6" w:themeFill="accent4" w:themeFillShade="BF"/>
       </w:tcPr>
     </w:tblStylePr>
     <w:tblStylePr w:type="lastCol">
@@ -14412,7 +14468,7 @@
       </w:rPr>
       <w:tblPr/>
       <w:tcPr>
-        <w:shd w:val="clear" w:color="auto" w:fill="5F497A" w:themeFill="accent4" w:themeFillShade="BF"/>
+        <w:shd w:val="clear" w:color="auto" w:fill="F5F0E6" w:themeFill="accent4" w:themeFillShade="BF"/>
       </w:tcPr>
     </w:tblStylePr>
     <w:tblStylePr w:type="band1Vert">
@@ -14483,7 +14539,7 @@
       </w:rPr>
       <w:tblPr/>
       <w:tcPr>
-        <w:shd w:val="clear" w:color="auto" w:fill="31849B" w:themeFill="accent5" w:themeFillShade="BF"/>
+        <w:shd w:val="clear" w:color="auto" w:fill="F5F0E6" w:themeFill="accent5" w:themeFillShade="BF"/>
       </w:tcPr>
     </w:tblStylePr>
     <w:tblStylePr w:type="lastCol">
@@ -14492,7 +14548,7 @@
       </w:rPr>
       <w:tblPr/>
       <w:tcPr>
-        <w:shd w:val="clear" w:color="auto" w:fill="31849B" w:themeFill="accent5" w:themeFillShade="BF"/>
+        <w:shd w:val="clear" w:color="auto" w:fill="F5F0E6" w:themeFill="accent5" w:themeFillShade="BF"/>
       </w:tcPr>
     </w:tblStylePr>
     <w:tblStylePr w:type="band1Vert">
@@ -14770,7 +14826,7 @@
       <w:rFonts w:asciiTheme="majorHAnsi" w:eastAsiaTheme="majorEastAsia" w:hAnsiTheme="majorHAnsi" w:cstheme="majorBidi"/>
       <w:b/>
       <w:bCs/>
-      <w:color w:val="365F91" w:themeColor="accent1" w:themeShade="BF"/>
+      <w:color w:val="1A1A1A" w:themeColor="accent1" w:themeShade="BF"/>
       <w:sz w:val="28"/>
       <w:szCs w:val="28"/>
     </w:rPr>
@@ -14794,7 +14850,7 @@
       <w:rFonts w:asciiTheme="majorHAnsi" w:eastAsiaTheme="majorEastAsia" w:hAnsiTheme="majorHAnsi" w:cstheme="majorBidi"/>
       <w:b/>
       <w:bCs/>
-      <w:color w:val="4F81BD" w:themeColor="accent1"/>
+      <w:color w:val="1A1A1A" w:themeColor="accent1"/>
       <w:sz w:val="26"/>
       <w:szCs w:val="26"/>
     </w:rPr>
@@ -14818,7 +14874,7 @@
       <w:rFonts w:asciiTheme="majorHAnsi" w:eastAsiaTheme="majorEastAsia" w:hAnsiTheme="majorHAnsi" w:cstheme="majorBidi"/>
       <w:b/>
       <w:bCs/>
-      <w:color w:val="4F81BD" w:themeColor="accent1"/>
+      <w:color w:val="1A1A1A" w:themeColor="accent1"/>
     </w:rPr>
   </w:style>
   <w:style w:type="paragraph" w:styleId="Heading4">
@@ -14843,7 +14899,7 @@
       <w:bCs/>
       <w:i/>
       <w:iCs/>
-      <w:color w:val="4F81BD" w:themeColor="accent1"/>
+      <w:color w:val="1A1A1A" w:themeColor="accent1"/>
     </w:rPr>
   </w:style>
   <w:style w:type="paragraph" w:styleId="Heading5">
@@ -14864,7 +14920,7 @@
     </w:pPr>
     <w:rPr>
       <w:rFonts w:asciiTheme="majorHAnsi" w:eastAsiaTheme="majorEastAsia" w:hAnsiTheme="majorHAnsi" w:cstheme="majorBidi"/>
-      <w:color w:val="243F60" w:themeColor="accent1" w:themeShade="7F"/>
+      <w:color w:val="1A1A1A" w:themeColor="accent1" w:themeShade="7F"/>
     </w:rPr>
   </w:style>
   <w:style w:type="paragraph" w:styleId="Heading6">
@@ -14887,7 +14943,7 @@
       <w:rFonts w:asciiTheme="majorHAnsi" w:eastAsiaTheme="majorEastAsia" w:hAnsiTheme="majorHAnsi" w:cstheme="majorBidi"/>
       <w:i/>
       <w:iCs/>
-      <w:color w:val="243F60" w:themeColor="accent1" w:themeShade="7F"/>
+      <w:color w:val="1A1A1A" w:themeColor="accent1" w:themeShade="7F"/>
     </w:rPr>
   </w:style>
   <w:style w:type="paragraph" w:styleId="Heading7">
@@ -14931,7 +14987,7 @@
     </w:pPr>
     <w:rPr>
       <w:rFonts w:asciiTheme="majorHAnsi" w:eastAsiaTheme="majorEastAsia" w:hAnsiTheme="majorHAnsi" w:cstheme="majorBidi"/>
-      <w:color w:val="4F81BD" w:themeColor="accent1"/>
+      <w:color w:val="1A1A1A" w:themeColor="accent1"/>
       <w:sz w:val="20"/>
       <w:szCs w:val="20"/>
     </w:rPr>
@@ -15007,7 +15063,7 @@
       <w:rFonts w:asciiTheme="majorHAnsi" w:eastAsiaTheme="majorEastAsia" w:hAnsiTheme="majorHAnsi" w:cstheme="majorBidi"/>
       <w:b/>
       <w:bCs/>
-      <w:color w:val="365F91" w:themeColor="accent1" w:themeShade="BF"/>
+      <w:color w:val="1A1A1A" w:themeColor="accent1" w:themeShade="BF"/>
       <w:sz w:val="28"/>
       <w:szCs w:val="28"/>
     </w:rPr>
@@ -15022,7 +15078,7 @@
       <w:rFonts w:asciiTheme="majorHAnsi" w:eastAsiaTheme="majorEastAsia" w:hAnsiTheme="majorHAnsi" w:cstheme="majorBidi"/>
       <w:b/>
       <w:bCs/>
-      <w:color w:val="4F81BD" w:themeColor="accent1"/>
+      <w:color w:val="1A1A1A" w:themeColor="accent1"/>
       <w:sz w:val="26"/>
       <w:szCs w:val="26"/>
     </w:rPr>
@@ -15037,7 +15093,7 @@
       <w:rFonts w:asciiTheme="majorHAnsi" w:eastAsiaTheme="majorEastAsia" w:hAnsiTheme="majorHAnsi" w:cstheme="majorBidi"/>
       <w:b/>
       <w:bCs/>
-      <w:color w:val="4F81BD" w:themeColor="accent1"/>
+      <w:color w:val="1A1A1A" w:themeColor="accent1"/>
     </w:rPr>
   </w:style>
   <w:style w:type="paragraph" w:styleId="Title">
@@ -15057,7 +15113,7 @@
     </w:pPr>
     <w:rPr>
       <w:rFonts w:asciiTheme="majorHAnsi" w:eastAsiaTheme="majorEastAsia" w:hAnsiTheme="majorHAnsi" w:cstheme="majorBidi"/>
-      <w:color w:val="17365D" w:themeColor="text2" w:themeShade="BF"/>
+      <w:color w:val="1A1A1A" w:themeColor="text2" w:themeShade="BF"/>
       <w:spacing w:val="5"/>
       <w:kern w:val="28"/>
       <w:sz w:val="52"/>
@@ -15072,7 +15128,7 @@
     <w:rsid w:val="00FC693F"/>
     <w:rPr>
       <w:rFonts w:asciiTheme="majorHAnsi" w:eastAsiaTheme="majorEastAsia" w:hAnsiTheme="majorHAnsi" w:cstheme="majorBidi"/>
-      <w:color w:val="17365D" w:themeColor="text2" w:themeShade="BF"/>
+      <w:color w:val="1A1A1A" w:themeColor="text2" w:themeShade="BF"/>
       <w:spacing w:val="5"/>
       <w:kern w:val="28"/>
       <w:sz w:val="52"/>
@@ -15096,7 +15152,7 @@
       <w:rFonts w:asciiTheme="majorHAnsi" w:eastAsiaTheme="majorEastAsia" w:hAnsiTheme="majorHAnsi" w:cstheme="majorBidi"/>
       <w:i/>
       <w:iCs/>
-      <w:color w:val="4F81BD" w:themeColor="accent1"/>
+      <w:color w:val="1A1A1A" w:themeColor="accent1"/>
       <w:spacing w:val="15"/>
       <w:sz w:val="24"/>
       <w:szCs w:val="24"/>
@@ -15112,7 +15168,7 @@
       <w:rFonts w:asciiTheme="majorHAnsi" w:eastAsiaTheme="majorEastAsia" w:hAnsiTheme="majorHAnsi" w:cstheme="majorBidi"/>
       <w:i/>
       <w:iCs/>
-      <w:color w:val="4F81BD" w:themeColor="accent1"/>
+      <w:color w:val="1A1A1A" w:themeColor="accent1"/>
       <w:spacing w:val="15"/>
       <w:sz w:val="24"/>
       <w:szCs w:val="24"/>
@@ -15412,7 +15468,7 @@
       <w:bCs/>
       <w:i/>
       <w:iCs/>
-      <w:color w:val="4F81BD" w:themeColor="accent1"/>
+      <w:color w:val="1A1A1A" w:themeColor="accent1"/>
     </w:rPr>
   </w:style>
   <w:style w:type="character" w:customStyle="1" w:styleId="Heading5Char">
@@ -15424,7 +15480,7 @@
     <w:rsid w:val="00FC693F"/>
     <w:rPr>
       <w:rFonts w:asciiTheme="majorHAnsi" w:eastAsiaTheme="majorEastAsia" w:hAnsiTheme="majorHAnsi" w:cstheme="majorBidi"/>
-      <w:color w:val="243F60" w:themeColor="accent1" w:themeShade="7F"/>
+      <w:color w:val="1A1A1A" w:themeColor="accent1" w:themeShade="7F"/>
     </w:rPr>
   </w:style>
   <w:style w:type="character" w:customStyle="1" w:styleId="Heading6Char">
@@ -15438,7 +15494,7 @@
       <w:rFonts w:asciiTheme="majorHAnsi" w:eastAsiaTheme="majorEastAsia" w:hAnsiTheme="majorHAnsi" w:cstheme="majorBidi"/>
       <w:i/>
       <w:iCs/>
-      <w:color w:val="243F60" w:themeColor="accent1" w:themeShade="7F"/>
+      <w:color w:val="1A1A1A" w:themeColor="accent1" w:themeShade="7F"/>
     </w:rPr>
   </w:style>
   <w:style w:type="character" w:customStyle="1" w:styleId="Heading7Char">
@@ -15464,7 +15520,7 @@
     <w:rsid w:val="00FC693F"/>
     <w:rPr>
       <w:rFonts w:asciiTheme="majorHAnsi" w:eastAsiaTheme="majorEastAsia" w:hAnsiTheme="majorHAnsi" w:cstheme="majorBidi"/>
-      <w:color w:val="4F81BD" w:themeColor="accent1"/>
+      <w:color w:val="1A1A1A" w:themeColor="accent1"/>
       <w:sz w:val="20"/>
       <w:szCs w:val="20"/>
     </w:rPr>
@@ -15500,7 +15556,7 @@
     <w:rPr>
       <w:b/>
       <w:bCs/>
-      <w:color w:val="4F81BD" w:themeColor="accent1"/>
+      <w:color w:val="1A1A1A" w:themeColor="accent1"/>
       <w:sz w:val="18"/>
       <w:szCs w:val="18"/>
     </w:rPr>
@@ -15547,7 +15603,7 @@
       <w:bCs/>
       <w:i/>
       <w:iCs/>
-      <w:color w:val="4F81BD" w:themeColor="accent1"/>
+      <w:color w:val="1A1A1A" w:themeColor="accent1"/>
     </w:rPr>
   </w:style>
   <w:style w:type="character" w:customStyle="1" w:styleId="IntenseQuoteChar">
@@ -15561,7 +15617,7 @@
       <w:bCs/>
       <w:i/>
       <w:iCs/>
-      <w:color w:val="4F81BD" w:themeColor="accent1"/>
+      <w:color w:val="1A1A1A" w:themeColor="accent1"/>
     </w:rPr>
   </w:style>
   <w:style w:type="character" w:styleId="SubtleEmphasis">
@@ -15587,7 +15643,7 @@
       <w:bCs/>
       <w:i/>
       <w:iCs/>
-      <w:color w:val="4F81BD" w:themeColor="accent1"/>
+      <w:color w:val="1A1A1A" w:themeColor="accent1"/>
     </w:rPr>
   </w:style>
   <w:style w:type="character" w:styleId="SubtleReference">
@@ -15781,7 +15837,7 @@
       <w:spacing w:after="0" w:line="240" w:lineRule="auto"/>
     </w:pPr>
     <w:rPr>
-      <w:color w:val="365F91" w:themeColor="accent1" w:themeShade="BF"/>
+      <w:color w:val="1A1A1A" w:themeColor="accent1" w:themeShade="BF"/>
     </w:rPr>
     <w:tblPr>
       <w:tblStyleRowBandSize w:val="1"/>
@@ -16090,7 +16146,7 @@
       <w:spacing w:after="0" w:line="240" w:lineRule="auto"/>
     </w:pPr>
     <w:rPr>
-      <w:color w:val="5F497A" w:themeColor="accent4" w:themeShade="BF"/>
+      <w:color w:val="1A1A1A" w:themeColor="accent4" w:themeShade="BF"/>
     </w:rPr>
     <w:tblPr>
       <w:tblStyleRowBandSize w:val="1"/>
@@ -16193,7 +16249,7 @@
       <w:spacing w:after="0" w:line="240" w:lineRule="auto"/>
     </w:pPr>
     <w:rPr>
-      <w:color w:val="31849B" w:themeColor="accent5" w:themeShade="BF"/>
+      <w:color w:val="1A1A1A" w:themeColor="accent5" w:themeShade="BF"/>
     </w:rPr>
     <w:tblPr>
       <w:tblStyleRowBandSize w:val="1"/>
@@ -16518,7 +16574,7 @@
       </w:rPr>
       <w:tblPr/>
       <w:tcPr>
-        <w:shd w:val="clear" w:color="auto" w:fill="4F81BD" w:themeFill="accent1"/>
+        <w:shd w:val="clear" w:color="auto" w:fill="F5F0E6" w:themeFill="accent1"/>
       </w:tcPr>
     </w:tblStylePr>
     <w:tblStylePr w:type="lastRow">
@@ -16794,7 +16850,7 @@
       </w:rPr>
       <w:tblPr/>
       <w:tcPr>
-        <w:shd w:val="clear" w:color="auto" w:fill="8064A2" w:themeFill="accent4"/>
+        <w:shd w:val="clear" w:color="auto" w:fill="F5F0E6" w:themeFill="accent4"/>
       </w:tcPr>
     </w:tblStylePr>
     <w:tblStylePr w:type="lastRow">
@@ -16886,7 +16942,7 @@
       </w:rPr>
       <w:tblPr/>
       <w:tcPr>
-        <w:shd w:val="clear" w:color="auto" w:fill="4BACC6" w:themeFill="accent5"/>
+        <w:shd w:val="clear" w:color="auto" w:fill="F5F0E6" w:themeFill="accent5"/>
       </w:tcPr>
     </w:tblStylePr>
     <w:tblStylePr w:type="lastRow">
@@ -18095,7 +18151,7 @@
           <w:insideH w:val="nil"/>
           <w:insideV w:val="nil"/>
         </w:tcBorders>
-        <w:shd w:val="clear" w:color="auto" w:fill="4F81BD" w:themeFill="accent1"/>
+        <w:shd w:val="clear" w:color="auto" w:fill="F5F0E6" w:themeFill="accent1"/>
       </w:tcPr>
     </w:tblStylePr>
     <w:tblStylePr w:type="lastRow">
@@ -18413,7 +18469,7 @@
           <w:insideH w:val="nil"/>
           <w:insideV w:val="nil"/>
         </w:tcBorders>
-        <w:shd w:val="clear" w:color="auto" w:fill="8064A2" w:themeFill="accent4"/>
+        <w:shd w:val="clear" w:color="auto" w:fill="F5F0E6" w:themeFill="accent4"/>
       </w:tcPr>
     </w:tblStylePr>
     <w:tblStylePr w:type="lastRow">
@@ -18519,7 +18575,7 @@
           <w:insideH w:val="nil"/>
           <w:insideV w:val="nil"/>
         </w:tcBorders>
-        <w:shd w:val="clear" w:color="auto" w:fill="4BACC6" w:themeFill="accent5"/>
+        <w:shd w:val="clear" w:color="auto" w:fill="F5F0E6" w:themeFill="accent5"/>
       </w:tcPr>
     </w:tblStylePr>
     <w:tblStylePr w:type="lastRow">
@@ -18877,7 +18933,7 @@
           <w:insideH w:val="nil"/>
           <w:insideV w:val="nil"/>
         </w:tcBorders>
-        <w:shd w:val="clear" w:color="auto" w:fill="4F81BD" w:themeFill="accent1"/>
+        <w:shd w:val="clear" w:color="auto" w:fill="F5F0E6" w:themeFill="accent1"/>
       </w:tcPr>
     </w:tblStylePr>
     <w:tblStylePr w:type="lastRow">
@@ -18916,7 +18972,7 @@
           <w:insideH w:val="nil"/>
           <w:insideV w:val="nil"/>
         </w:tcBorders>
-        <w:shd w:val="clear" w:color="auto" w:fill="4F81BD" w:themeFill="accent1"/>
+        <w:shd w:val="clear" w:color="auto" w:fill="F5F0E6" w:themeFill="accent1"/>
       </w:tcPr>
     </w:tblStylePr>
     <w:tblStylePr w:type="lastCol">
@@ -18933,7 +18989,7 @@
           <w:insideH w:val="nil"/>
           <w:insideV w:val="nil"/>
         </w:tcBorders>
-        <w:shd w:val="clear" w:color="auto" w:fill="4F81BD" w:themeFill="accent1"/>
+        <w:shd w:val="clear" w:color="auto" w:fill="F5F0E6" w:themeFill="accent1"/>
       </w:tcPr>
     </w:tblStylePr>
     <w:tblStylePr w:type="band1Vert">
@@ -19324,7 +19380,7 @@
           <w:insideH w:val="nil"/>
           <w:insideV w:val="nil"/>
         </w:tcBorders>
-        <w:shd w:val="clear" w:color="auto" w:fill="8064A2" w:themeFill="accent4"/>
+        <w:shd w:val="clear" w:color="auto" w:fill="F5F0E6" w:themeFill="accent4"/>
       </w:tcPr>
     </w:tblStylePr>
     <w:tblStylePr w:type="lastRow">
@@ -19363,7 +19419,7 @@
           <w:insideH w:val="nil"/>
           <w:insideV w:val="nil"/>
         </w:tcBorders>
-        <w:shd w:val="clear" w:color="auto" w:fill="8064A2" w:themeFill="accent4"/>
+        <w:shd w:val="clear" w:color="auto" w:fill="F5F0E6" w:themeFill="accent4"/>
       </w:tcPr>
     </w:tblStylePr>
     <w:tblStylePr w:type="lastCol">
@@ -19380,7 +19436,7 @@
           <w:insideH w:val="nil"/>
           <w:insideV w:val="nil"/>
         </w:tcBorders>
-        <w:shd w:val="clear" w:color="auto" w:fill="8064A2" w:themeFill="accent4"/>
+        <w:shd w:val="clear" w:color="auto" w:fill="F5F0E6" w:themeFill="accent4"/>
       </w:tcPr>
     </w:tblStylePr>
     <w:tblStylePr w:type="band1Vert">
@@ -19473,7 +19529,7 @@
           <w:insideH w:val="nil"/>
           <w:insideV w:val="nil"/>
         </w:tcBorders>
-        <w:shd w:val="clear" w:color="auto" w:fill="4BACC6" w:themeFill="accent5"/>
+        <w:shd w:val="clear" w:color="auto" w:fill="F5F0E6" w:themeFill="accent5"/>
       </w:tcPr>
     </w:tblStylePr>
     <w:tblStylePr w:type="lastRow">
@@ -19512,7 +19568,7 @@
           <w:insideH w:val="nil"/>
           <w:insideV w:val="nil"/>
         </w:tcBorders>
-        <w:shd w:val="clear" w:color="auto" w:fill="4BACC6" w:themeFill="accent5"/>
+        <w:shd w:val="clear" w:color="auto" w:fill="F5F0E6" w:themeFill="accent5"/>
       </w:tcPr>
     </w:tblStylePr>
     <w:tblStylePr w:type="lastCol">
@@ -19529,7 +19585,7 @@
           <w:insideH w:val="nil"/>
           <w:insideV w:val="nil"/>
         </w:tcBorders>
-        <w:shd w:val="clear" w:color="auto" w:fill="4BACC6" w:themeFill="accent5"/>
+        <w:shd w:val="clear" w:color="auto" w:fill="F5F0E6" w:themeFill="accent5"/>
       </w:tcPr>
     </w:tblStylePr>
     <w:tblStylePr w:type="band1Vert">
@@ -19771,7 +19827,7 @@
       <w:rPr>
         <w:b/>
         <w:bCs/>
-        <w:color w:val="1F497D" w:themeColor="text2"/>
+        <w:color w:val="1A1A1A" w:themeColor="text2"/>
       </w:rPr>
       <w:tblPr/>
       <w:tcPr>
@@ -19855,7 +19911,7 @@
       <w:rPr>
         <w:b/>
         <w:bCs/>
-        <w:color w:val="1F497D" w:themeColor="text2"/>
+        <w:color w:val="1A1A1A" w:themeColor="text2"/>
       </w:rPr>
       <w:tblPr/>
       <w:tcPr>
@@ -19939,7 +19995,7 @@
       <w:rPr>
         <w:b/>
         <w:bCs/>
-        <w:color w:val="1F497D" w:themeColor="text2"/>
+        <w:color w:val="1A1A1A" w:themeColor="text2"/>
       </w:rPr>
       <w:tblPr/>
       <w:tcPr>
@@ -20023,7 +20079,7 @@
       <w:rPr>
         <w:b/>
         <w:bCs/>
-        <w:color w:val="1F497D" w:themeColor="text2"/>
+        <w:color w:val="1A1A1A" w:themeColor="text2"/>
       </w:rPr>
       <w:tblPr/>
       <w:tcPr>
@@ -20107,7 +20163,7 @@
       <w:rPr>
         <w:b/>
         <w:bCs/>
-        <w:color w:val="1F497D" w:themeColor="text2"/>
+        <w:color w:val="1A1A1A" w:themeColor="text2"/>
       </w:rPr>
       <w:tblPr/>
       <w:tcPr>
@@ -20191,7 +20247,7 @@
       <w:rPr>
         <w:b/>
         <w:bCs/>
-        <w:color w:val="1F497D" w:themeColor="text2"/>
+        <w:color w:val="1A1A1A" w:themeColor="text2"/>
       </w:rPr>
       <w:tblPr/>
       <w:tcPr>
@@ -20275,7 +20331,7 @@
       <w:rPr>
         <w:b/>
         <w:bCs/>
-        <w:color w:val="1F497D" w:themeColor="text2"/>
+        <w:color w:val="1A1A1A" w:themeColor="text2"/>
       </w:rPr>
       <w:tblPr/>
       <w:tcPr>
@@ -21349,13 +21405,13 @@
     <w:tblStylePr w:type="band1Vert">
       <w:tblPr/>
       <w:tcPr>
-        <w:shd w:val="clear" w:color="auto" w:fill="A7BFDE" w:themeFill="accent1" w:themeFillTint="7F"/>
+        <w:shd w:val="clear" w:color="auto" w:fill="F5F0E6" w:themeFill="accent1" w:themeFillTint="7F"/>
       </w:tcPr>
     </w:tblStylePr>
     <w:tblStylePr w:type="band1Horz">
       <w:tblPr/>
       <w:tcPr>
-        <w:shd w:val="clear" w:color="auto" w:fill="A7BFDE" w:themeFill="accent1" w:themeFillTint="7F"/>
+        <w:shd w:val="clear" w:color="auto" w:fill="F5F0E6" w:themeFill="accent1" w:themeFillTint="7F"/>
       </w:tcPr>
     </w:tblStylePr>
   </w:style>
@@ -21954,7 +22010,7 @@
     <w:tblStylePr w:type="band1Vert">
       <w:tblPr/>
       <w:tcPr>
-        <w:shd w:val="clear" w:color="auto" w:fill="A7BFDE" w:themeFill="accent1" w:themeFillTint="7F"/>
+        <w:shd w:val="clear" w:color="auto" w:fill="F5F0E6" w:themeFill="accent1" w:themeFillTint="7F"/>
       </w:tcPr>
     </w:tblStylePr>
     <w:tblStylePr w:type="band1Horz">
@@ -21964,7 +22020,7 @@
           <w:insideH w:val="single" w:sz="6" w:space="0" w:color="4F81BD" w:themeColor="accent1"/>
           <w:insideV w:val="single" w:sz="6" w:space="0" w:color="4F81BD" w:themeColor="accent1"/>
         </w:tcBorders>
-        <w:shd w:val="clear" w:color="auto" w:fill="A7BFDE" w:themeFill="accent1" w:themeFillTint="7F"/>
+        <w:shd w:val="clear" w:color="auto" w:fill="F5F0E6" w:themeFill="accent1" w:themeFillTint="7F"/>
       </w:tcPr>
     </w:tblStylePr>
     <w:tblStylePr w:type="nwCell">
@@ -22788,7 +22844,7 @@
           <w:insideH w:val="nil"/>
           <w:insideV w:val="single" w:sz="8" w:space="0" w:color="FFFFFF" w:themeColor="background1"/>
         </w:tcBorders>
-        <w:shd w:val="clear" w:color="auto" w:fill="4F81BD" w:themeFill="accent1"/>
+        <w:shd w:val="clear" w:color="auto" w:fill="F5F0E6" w:themeFill="accent1"/>
       </w:tcPr>
     </w:tblStylePr>
     <w:tblStylePr w:type="lastRow">
@@ -22809,7 +22865,7 @@
           <w:insideH w:val="nil"/>
           <w:insideV w:val="single" w:sz="8" w:space="0" w:color="FFFFFF" w:themeColor="background1"/>
         </w:tcBorders>
-        <w:shd w:val="clear" w:color="auto" w:fill="4F81BD" w:themeFill="accent1"/>
+        <w:shd w:val="clear" w:color="auto" w:fill="F5F0E6" w:themeFill="accent1"/>
       </w:tcPr>
     </w:tblStylePr>
     <w:tblStylePr w:type="firstCol">
@@ -22828,7 +22884,7 @@
           <w:insideH w:val="nil"/>
           <w:insideV w:val="nil"/>
         </w:tcBorders>
-        <w:shd w:val="clear" w:color="auto" w:fill="4F81BD" w:themeFill="accent1"/>
+        <w:shd w:val="clear" w:color="auto" w:fill="F5F0E6" w:themeFill="accent1"/>
       </w:tcPr>
     </w:tblStylePr>
     <w:tblStylePr w:type="lastCol">
@@ -22849,7 +22905,7 @@
           <w:insideH w:val="nil"/>
           <w:insideV w:val="nil"/>
         </w:tcBorders>
-        <w:shd w:val="clear" w:color="auto" w:fill="4F81BD" w:themeFill="accent1"/>
+        <w:shd w:val="clear" w:color="auto" w:fill="F5F0E6" w:themeFill="accent1"/>
       </w:tcPr>
     </w:tblStylePr>
     <w:tblStylePr w:type="band1Vert">
@@ -22863,7 +22919,7 @@
           <w:insideH w:val="nil"/>
           <w:insideV w:val="nil"/>
         </w:tcBorders>
-        <w:shd w:val="clear" w:color="auto" w:fill="A7BFDE" w:themeFill="accent1" w:themeFillTint="7F"/>
+        <w:shd w:val="clear" w:color="auto" w:fill="F5F0E6" w:themeFill="accent1" w:themeFillTint="7F"/>
       </w:tcPr>
     </w:tblStylePr>
     <w:tblStylePr w:type="band1Horz">
@@ -22877,7 +22933,7 @@
           <w:insideH w:val="single" w:sz="8" w:space="0" w:color="FFFFFF" w:themeColor="background1"/>
           <w:insideV w:val="single" w:sz="8" w:space="0" w:color="FFFFFF" w:themeColor="background1"/>
         </w:tcBorders>
-        <w:shd w:val="clear" w:color="auto" w:fill="A7BFDE" w:themeFill="accent1" w:themeFillTint="7F"/>
+        <w:shd w:val="clear" w:color="auto" w:fill="F5F0E6" w:themeFill="accent1" w:themeFillTint="7F"/>
       </w:tcPr>
     </w:tblStylePr>
   </w:style>
@@ -23211,7 +23267,7 @@
           <w:insideH w:val="nil"/>
           <w:insideV w:val="single" w:sz="8" w:space="0" w:color="FFFFFF" w:themeColor="background1"/>
         </w:tcBorders>
-        <w:shd w:val="clear" w:color="auto" w:fill="8064A2" w:themeFill="accent4"/>
+        <w:shd w:val="clear" w:color="auto" w:fill="F5F0E6" w:themeFill="accent4"/>
       </w:tcPr>
     </w:tblStylePr>
     <w:tblStylePr w:type="lastRow">
@@ -23232,7 +23288,7 @@
           <w:insideH w:val="nil"/>
           <w:insideV w:val="single" w:sz="8" w:space="0" w:color="FFFFFF" w:themeColor="background1"/>
         </w:tcBorders>
-        <w:shd w:val="clear" w:color="auto" w:fill="8064A2" w:themeFill="accent4"/>
+        <w:shd w:val="clear" w:color="auto" w:fill="F5F0E6" w:themeFill="accent4"/>
       </w:tcPr>
     </w:tblStylePr>
     <w:tblStylePr w:type="firstCol">
@@ -23251,7 +23307,7 @@
           <w:insideH w:val="nil"/>
           <w:insideV w:val="nil"/>
         </w:tcBorders>
-        <w:shd w:val="clear" w:color="auto" w:fill="8064A2" w:themeFill="accent4"/>
+        <w:shd w:val="clear" w:color="auto" w:fill="F5F0E6" w:themeFill="accent4"/>
       </w:tcPr>
     </w:tblStylePr>
     <w:tblStylePr w:type="lastCol">
@@ -23272,7 +23328,7 @@
           <w:insideH w:val="nil"/>
           <w:insideV w:val="nil"/>
         </w:tcBorders>
-        <w:shd w:val="clear" w:color="auto" w:fill="8064A2" w:themeFill="accent4"/>
+        <w:shd w:val="clear" w:color="auto" w:fill="F5F0E6" w:themeFill="accent4"/>
       </w:tcPr>
     </w:tblStylePr>
     <w:tblStylePr w:type="band1Vert">
@@ -23352,7 +23408,7 @@
           <w:insideH w:val="nil"/>
           <w:insideV w:val="single" w:sz="8" w:space="0" w:color="FFFFFF" w:themeColor="background1"/>
         </w:tcBorders>
-        <w:shd w:val="clear" w:color="auto" w:fill="4BACC6" w:themeFill="accent5"/>
+        <w:shd w:val="clear" w:color="auto" w:fill="F5F0E6" w:themeFill="accent5"/>
       </w:tcPr>
     </w:tblStylePr>
     <w:tblStylePr w:type="lastRow">
@@ -23373,7 +23429,7 @@
           <w:insideH w:val="nil"/>
           <w:insideV w:val="single" w:sz="8" w:space="0" w:color="FFFFFF" w:themeColor="background1"/>
         </w:tcBorders>
-        <w:shd w:val="clear" w:color="auto" w:fill="4BACC6" w:themeFill="accent5"/>
+        <w:shd w:val="clear" w:color="auto" w:fill="F5F0E6" w:themeFill="accent5"/>
       </w:tcPr>
     </w:tblStylePr>
     <w:tblStylePr w:type="firstCol">
@@ -23392,7 +23448,7 @@
           <w:insideH w:val="nil"/>
           <w:insideV w:val="nil"/>
         </w:tcBorders>
-        <w:shd w:val="clear" w:color="auto" w:fill="4BACC6" w:themeFill="accent5"/>
+        <w:shd w:val="clear" w:color="auto" w:fill="F5F0E6" w:themeFill="accent5"/>
       </w:tcPr>
     </w:tblStylePr>
     <w:tblStylePr w:type="lastCol">
@@ -23413,7 +23469,7 @@
           <w:insideH w:val="nil"/>
           <w:insideV w:val="nil"/>
         </w:tcBorders>
-        <w:shd w:val="clear" w:color="auto" w:fill="4BACC6" w:themeFill="accent5"/>
+        <w:shd w:val="clear" w:color="auto" w:fill="F5F0E6" w:themeFill="accent5"/>
       </w:tcPr>
     </w:tblStylePr>
     <w:tblStylePr w:type="band1Vert">
@@ -23723,7 +23779,7 @@
       </w:tblCellMar>
     </w:tblPr>
     <w:tcPr>
-      <w:shd w:val="clear" w:color="auto" w:fill="4F81BD" w:themeFill="accent1"/>
+      <w:shd w:val="clear" w:color="auto" w:fill="F5F0E6" w:themeFill="accent1"/>
     </w:tcPr>
     <w:tblStylePr w:type="firstRow">
       <w:rPr>
@@ -23754,7 +23810,7 @@
           <w:insideH w:val="nil"/>
           <w:insideV w:val="nil"/>
         </w:tcBorders>
-        <w:shd w:val="clear" w:color="auto" w:fill="243F60" w:themeFill="accent1" w:themeFillShade="7F"/>
+        <w:shd w:val="clear" w:color="auto" w:fill="F5F0E6" w:themeFill="accent1" w:themeFillShade="7F"/>
       </w:tcPr>
     </w:tblStylePr>
     <w:tblStylePr w:type="firstCol">
@@ -23768,7 +23824,7 @@
           <w:insideH w:val="nil"/>
           <w:insideV w:val="nil"/>
         </w:tcBorders>
-        <w:shd w:val="clear" w:color="auto" w:fill="365F91" w:themeFill="accent1" w:themeFillShade="BF"/>
+        <w:shd w:val="clear" w:color="auto" w:fill="F5F0E6" w:themeFill="accent1" w:themeFillShade="BF"/>
       </w:tcPr>
     </w:tblStylePr>
     <w:tblStylePr w:type="lastCol">
@@ -23782,7 +23838,7 @@
           <w:insideH w:val="nil"/>
           <w:insideV w:val="nil"/>
         </w:tcBorders>
-        <w:shd w:val="clear" w:color="auto" w:fill="365F91" w:themeFill="accent1" w:themeFillShade="BF"/>
+        <w:shd w:val="clear" w:color="auto" w:fill="F5F0E6" w:themeFill="accent1" w:themeFillShade="BF"/>
       </w:tcPr>
     </w:tblStylePr>
     <w:tblStylePr w:type="band1Vert">
@@ -23796,7 +23852,7 @@
           <w:insideH w:val="nil"/>
           <w:insideV w:val="nil"/>
         </w:tcBorders>
-        <w:shd w:val="clear" w:color="auto" w:fill="365F91" w:themeFill="accent1" w:themeFillShade="BF"/>
+        <w:shd w:val="clear" w:color="auto" w:fill="F5F0E6" w:themeFill="accent1" w:themeFillShade="BF"/>
       </w:tcPr>
     </w:tblStylePr>
     <w:tblStylePr w:type="band1Horz">
@@ -23810,7 +23866,7 @@
           <w:insideH w:val="nil"/>
           <w:insideV w:val="nil"/>
         </w:tcBorders>
-        <w:shd w:val="clear" w:color="auto" w:fill="365F91" w:themeFill="accent1" w:themeFillShade="BF"/>
+        <w:shd w:val="clear" w:color="auto" w:fill="F5F0E6" w:themeFill="accent1" w:themeFillShade="BF"/>
       </w:tcPr>
     </w:tblStylePr>
   </w:style>
@@ -24065,7 +24121,7 @@
       </w:tblCellMar>
     </w:tblPr>
     <w:tcPr>
-      <w:shd w:val="clear" w:color="auto" w:fill="8064A2" w:themeFill="accent4"/>
+      <w:shd w:val="clear" w:color="auto" w:fill="F5F0E6" w:themeFill="accent4"/>
     </w:tcPr>
     <w:tblStylePr w:type="firstRow">
       <w:rPr>
@@ -24110,7 +24166,7 @@
           <w:insideH w:val="nil"/>
           <w:insideV w:val="nil"/>
         </w:tcBorders>
-        <w:shd w:val="clear" w:color="auto" w:fill="5F497A" w:themeFill="accent4" w:themeFillShade="BF"/>
+        <w:shd w:val="clear" w:color="auto" w:fill="F5F0E6" w:themeFill="accent4" w:themeFillShade="BF"/>
       </w:tcPr>
     </w:tblStylePr>
     <w:tblStylePr w:type="lastCol">
@@ -24124,7 +24180,7 @@
           <w:insideH w:val="nil"/>
           <w:insideV w:val="nil"/>
         </w:tcBorders>
-        <w:shd w:val="clear" w:color="auto" w:fill="5F497A" w:themeFill="accent4" w:themeFillShade="BF"/>
+        <w:shd w:val="clear" w:color="auto" w:fill="F5F0E6" w:themeFill="accent4" w:themeFillShade="BF"/>
       </w:tcPr>
     </w:tblStylePr>
     <w:tblStylePr w:type="band1Vert">
@@ -24138,7 +24194,7 @@
           <w:insideH w:val="nil"/>
           <w:insideV w:val="nil"/>
         </w:tcBorders>
-        <w:shd w:val="clear" w:color="auto" w:fill="5F497A" w:themeFill="accent4" w:themeFillShade="BF"/>
+        <w:shd w:val="clear" w:color="auto" w:fill="F5F0E6" w:themeFill="accent4" w:themeFillShade="BF"/>
       </w:tcPr>
     </w:tblStylePr>
     <w:tblStylePr w:type="band1Horz">
@@ -24152,7 +24208,7 @@
           <w:insideH w:val="nil"/>
           <w:insideV w:val="nil"/>
         </w:tcBorders>
-        <w:shd w:val="clear" w:color="auto" w:fill="5F497A" w:themeFill="accent4" w:themeFillShade="BF"/>
+        <w:shd w:val="clear" w:color="auto" w:fill="F5F0E6" w:themeFill="accent4" w:themeFillShade="BF"/>
       </w:tcPr>
     </w:tblStylePr>
   </w:style>
@@ -24179,7 +24235,7 @@
       </w:tblCellMar>
     </w:tblPr>
     <w:tcPr>
-      <w:shd w:val="clear" w:color="auto" w:fill="4BACC6" w:themeFill="accent5"/>
+      <w:shd w:val="clear" w:color="auto" w:fill="F5F0E6" w:themeFill="accent5"/>
     </w:tcPr>
     <w:tblStylePr w:type="firstRow">
       <w:rPr>
@@ -24224,7 +24280,7 @@
           <w:insideH w:val="nil"/>
           <w:insideV w:val="nil"/>
         </w:tcBorders>
-        <w:shd w:val="clear" w:color="auto" w:fill="31849B" w:themeFill="accent5" w:themeFillShade="BF"/>
+        <w:shd w:val="clear" w:color="auto" w:fill="F5F0E6" w:themeFill="accent5" w:themeFillShade="BF"/>
       </w:tcPr>
     </w:tblStylePr>
     <w:tblStylePr w:type="lastCol">
@@ -24238,7 +24294,7 @@
           <w:insideH w:val="nil"/>
           <w:insideV w:val="nil"/>
         </w:tcBorders>
-        <w:shd w:val="clear" w:color="auto" w:fill="31849B" w:themeFill="accent5" w:themeFillShade="BF"/>
+        <w:shd w:val="clear" w:color="auto" w:fill="F5F0E6" w:themeFill="accent5" w:themeFillShade="BF"/>
       </w:tcPr>
     </w:tblStylePr>
     <w:tblStylePr w:type="band1Vert">
@@ -24252,7 +24308,7 @@
           <w:insideH w:val="nil"/>
           <w:insideV w:val="nil"/>
         </w:tcBorders>
-        <w:shd w:val="clear" w:color="auto" w:fill="31849B" w:themeFill="accent5" w:themeFillShade="BF"/>
+        <w:shd w:val="clear" w:color="auto" w:fill="F5F0E6" w:themeFill="accent5" w:themeFillShade="BF"/>
       </w:tcPr>
     </w:tblStylePr>
     <w:tblStylePr w:type="band1Horz">
@@ -24266,7 +24322,7 @@
           <w:insideH w:val="nil"/>
           <w:insideV w:val="nil"/>
         </w:tcBorders>
-        <w:shd w:val="clear" w:color="auto" w:fill="31849B" w:themeFill="accent5" w:themeFillShade="BF"/>
+        <w:shd w:val="clear" w:color="auto" w:fill="F5F0E6" w:themeFill="accent5" w:themeFillShade="BF"/>
       </w:tcPr>
     </w:tblStylePr>
   </w:style>
@@ -24568,7 +24624,7 @@
         <w:tcBorders>
           <w:top w:val="single" w:sz="6" w:space="0" w:color="FFFFFF" w:themeColor="background1"/>
         </w:tcBorders>
-        <w:shd w:val="clear" w:color="auto" w:fill="2C4C74" w:themeFill="accent1" w:themeFillShade="99"/>
+        <w:shd w:val="clear" w:color="auto" w:fill="F5F0E6" w:themeFill="accent1" w:themeFillShade="99"/>
       </w:tcPr>
     </w:tblStylePr>
     <w:tblStylePr w:type="firstCol">
@@ -24585,7 +24641,7 @@
           <w:insideH w:val="single" w:sz="4" w:space="0" w:color="2C4C74" w:themeColor="accent1" w:themeShade="99"/>
           <w:insideV w:val="nil"/>
         </w:tcBorders>
-        <w:shd w:val="clear" w:color="auto" w:fill="2C4C74" w:themeFill="accent1" w:themeFillShade="99"/>
+        <w:shd w:val="clear" w:color="auto" w:fill="F5F0E6" w:themeFill="accent1" w:themeFillShade="99"/>
       </w:tcPr>
     </w:tblStylePr>
     <w:tblStylePr w:type="lastCol">
@@ -24602,19 +24658,19 @@
           <w:insideH w:val="nil"/>
           <w:insideV w:val="nil"/>
         </w:tcBorders>
-        <w:shd w:val="clear" w:color="auto" w:fill="2C4C74" w:themeFill="accent1" w:themeFillShade="99"/>
+        <w:shd w:val="clear" w:color="auto" w:fill="F5F0E6" w:themeFill="accent1" w:themeFillShade="99"/>
       </w:tcPr>
     </w:tblStylePr>
     <w:tblStylePr w:type="band1Vert">
       <w:tblPr/>
       <w:tcPr>
-        <w:shd w:val="clear" w:color="auto" w:fill="B8CCE4" w:themeFill="accent1" w:themeFillTint="66"/>
+        <w:shd w:val="clear" w:color="auto" w:fill="F5F0E6" w:themeFill="accent1" w:themeFillTint="66"/>
       </w:tcPr>
     </w:tblStylePr>
     <w:tblStylePr w:type="band1Horz">
       <w:tblPr/>
       <w:tcPr>
-        <w:shd w:val="clear" w:color="auto" w:fill="A7BFDE" w:themeFill="accent1" w:themeFillTint="7F"/>
+        <w:shd w:val="clear" w:color="auto" w:fill="F5F0E6" w:themeFill="accent1" w:themeFillTint="7F"/>
       </w:tcPr>
     </w:tblStylePr>
     <w:tblStylePr w:type="neCell">
@@ -25046,7 +25102,7 @@
         <w:tcBorders>
           <w:top w:val="single" w:sz="6" w:space="0" w:color="FFFFFF" w:themeColor="background1"/>
         </w:tcBorders>
-        <w:shd w:val="clear" w:color="auto" w:fill="276A7C" w:themeFill="accent5" w:themeFillShade="99"/>
+        <w:shd w:val="clear" w:color="auto" w:fill="F5F0E6" w:themeFill="accent5" w:themeFillShade="99"/>
       </w:tcPr>
     </w:tblStylePr>
     <w:tblStylePr w:type="firstCol">
@@ -25063,7 +25119,7 @@
           <w:insideH w:val="single" w:sz="4" w:space="0" w:color="276A7C" w:themeColor="accent5" w:themeShade="99"/>
           <w:insideV w:val="nil"/>
         </w:tcBorders>
-        <w:shd w:val="clear" w:color="auto" w:fill="276A7C" w:themeFill="accent5" w:themeFillShade="99"/>
+        <w:shd w:val="clear" w:color="auto" w:fill="F5F0E6" w:themeFill="accent5" w:themeFillShade="99"/>
       </w:tcPr>
     </w:tblStylePr>
     <w:tblStylePr w:type="lastCol">
@@ -25080,7 +25136,7 @@
           <w:insideH w:val="nil"/>
           <w:insideV w:val="nil"/>
         </w:tcBorders>
-        <w:shd w:val="clear" w:color="auto" w:fill="276A7C" w:themeFill="accent5" w:themeFillShade="99"/>
+        <w:shd w:val="clear" w:color="auto" w:fill="F5F0E6" w:themeFill="accent5" w:themeFillShade="99"/>
       </w:tcPr>
     </w:tblStylePr>
     <w:tblStylePr w:type="band1Vert">
@@ -25522,14 +25578,14 @@
         <w:tcBorders>
           <w:bottom w:val="single" w:sz="12" w:space="0" w:color="FFFFFF" w:themeColor="background1"/>
         </w:tcBorders>
-        <w:shd w:val="clear" w:color="auto" w:fill="664E82" w:themeFill="accent4" w:themeFillShade="CC"/>
+        <w:shd w:val="clear" w:color="auto" w:fill="F5F0E6" w:themeFill="accent4" w:themeFillShade="CC"/>
       </w:tcPr>
     </w:tblStylePr>
     <w:tblStylePr w:type="lastRow">
       <w:rPr>
         <w:b/>
         <w:bCs/>
-        <w:color w:val="664E82" w:themeColor="accent4" w:themeShade="CC"/>
+        <w:color w:val="1A1A1A" w:themeColor="accent4" w:themeShade="CC"/>
       </w:rPr>
       <w:tblPr/>
       <w:tcPr>
@@ -25780,14 +25836,14 @@
         <w:tcBorders>
           <w:bottom w:val="single" w:sz="12" w:space="0" w:color="FFFFFF" w:themeColor="background1"/>
         </w:tcBorders>
-        <w:shd w:val="clear" w:color="auto" w:fill="348DA5" w:themeFill="accent5" w:themeFillShade="CC"/>
+        <w:shd w:val="clear" w:color="auto" w:fill="F5F0E6" w:themeFill="accent5" w:themeFillShade="CC"/>
       </w:tcPr>
     </w:tblStylePr>
     <w:tblStylePr w:type="lastRow">
       <w:rPr>
         <w:b/>
         <w:bCs/>
-        <w:color w:val="348DA5" w:themeColor="accent5" w:themeShade="CC"/>
+        <w:color w:val="1A1A1A" w:themeColor="accent5" w:themeShade="CC"/>
       </w:rPr>
       <w:tblPr/>
       <w:tcPr>
@@ -25945,7 +26001,7 @@
       </w:rPr>
       <w:tblPr/>
       <w:tcPr>
-        <w:shd w:val="clear" w:color="auto" w:fill="B8CCE4" w:themeFill="accent1" w:themeFillTint="66"/>
+        <w:shd w:val="clear" w:color="auto" w:fill="F5F0E6" w:themeFill="accent1" w:themeFillTint="66"/>
       </w:tcPr>
     </w:tblStylePr>
     <w:tblStylePr w:type="lastRow">
@@ -25956,7 +26012,7 @@
       </w:rPr>
       <w:tblPr/>
       <w:tcPr>
-        <w:shd w:val="clear" w:color="auto" w:fill="B8CCE4" w:themeFill="accent1" w:themeFillTint="66"/>
+        <w:shd w:val="clear" w:color="auto" w:fill="F5F0E6" w:themeFill="accent1" w:themeFillTint="66"/>
       </w:tcPr>
     </w:tblStylePr>
     <w:tblStylePr w:type="firstCol">
@@ -25965,7 +26021,7 @@
       </w:rPr>
       <w:tblPr/>
       <w:tcPr>
-        <w:shd w:val="clear" w:color="auto" w:fill="365F91" w:themeFill="accent1" w:themeFillShade="BF"/>
+        <w:shd w:val="clear" w:color="auto" w:fill="F5F0E6" w:themeFill="accent1" w:themeFillShade="BF"/>
       </w:tcPr>
     </w:tblStylePr>
     <w:tblStylePr w:type="lastCol">
@@ -25974,19 +26030,19 @@
       </w:rPr>
       <w:tblPr/>
       <w:tcPr>
-        <w:shd w:val="clear" w:color="auto" w:fill="365F91" w:themeFill="accent1" w:themeFillShade="BF"/>
+        <w:shd w:val="clear" w:color="auto" w:fill="F5F0E6" w:themeFill="accent1" w:themeFillShade="BF"/>
       </w:tcPr>
     </w:tblStylePr>
     <w:tblStylePr w:type="band1Vert">
       <w:tblPr/>
       <w:tcPr>
-        <w:shd w:val="clear" w:color="auto" w:fill="A7BFDE" w:themeFill="accent1" w:themeFillTint="7F"/>
+        <w:shd w:val="clear" w:color="auto" w:fill="F5F0E6" w:themeFill="accent1" w:themeFillTint="7F"/>
       </w:tcPr>
     </w:tblStylePr>
     <w:tblStylePr w:type="band1Horz">
       <w:tblPr/>
       <w:tcPr>
-        <w:shd w:val="clear" w:color="auto" w:fill="A7BFDE" w:themeFill="accent1" w:themeFillTint="7F"/>
+        <w:shd w:val="clear" w:color="auto" w:fill="F5F0E6" w:themeFill="accent1" w:themeFillTint="7F"/>
       </w:tcPr>
     </w:tblStylePr>
   </w:style>
@@ -26205,7 +26261,7 @@
       </w:rPr>
       <w:tblPr/>
       <w:tcPr>
-        <w:shd w:val="clear" w:color="auto" w:fill="5F497A" w:themeFill="accent4" w:themeFillShade="BF"/>
+        <w:shd w:val="clear" w:color="auto" w:fill="F5F0E6" w:themeFill="accent4" w:themeFillShade="BF"/>
       </w:tcPr>
     </w:tblStylePr>
     <w:tblStylePr w:type="lastCol">
@@ -26214,7 +26270,7 @@
       </w:rPr>
       <w:tblPr/>
       <w:tcPr>
-        <w:shd w:val="clear" w:color="auto" w:fill="5F497A" w:themeFill="accent4" w:themeFillShade="BF"/>
+        <w:shd w:val="clear" w:color="auto" w:fill="F5F0E6" w:themeFill="accent4" w:themeFillShade="BF"/>
       </w:tcPr>
     </w:tblStylePr>
     <w:tblStylePr w:type="band1Vert">
@@ -26285,7 +26341,7 @@
       </w:rPr>
       <w:tblPr/>
       <w:tcPr>
-        <w:shd w:val="clear" w:color="auto" w:fill="31849B" w:themeFill="accent5" w:themeFillShade="BF"/>
+        <w:shd w:val="clear" w:color="auto" w:fill="F5F0E6" w:themeFill="accent5" w:themeFillShade="BF"/>
       </w:tcPr>
     </w:tblStylePr>
     <w:tblStylePr w:type="lastCol">
@@ -26294,7 +26350,7 @@
       </w:rPr>
       <w:tblPr/>
       <w:tcPr>
-        <w:shd w:val="clear" w:color="auto" w:fill="31849B" w:themeFill="accent5" w:themeFillShade="BF"/>
+        <w:shd w:val="clear" w:color="auto" w:fill="F5F0E6" w:themeFill="accent5" w:themeFillShade="BF"/>
       </w:tcPr>
     </w:tblStylePr>
     <w:tblStylePr w:type="band1Vert">
@@ -26404,13 +26460,13 @@
         <a:sysClr val="window" lastClr="FFFFFF"/>
       </a:lt1>
       <a:dk2>
-        <a:srgbClr val="1F497D"/>
+        <a:srgbClr val="1A1A1A"/>
       </a:dk2>
       <a:lt2>
         <a:srgbClr val="EEECE1"/>
       </a:lt2>
       <a:accent1>
-        <a:srgbClr val="4F81BD"/>
+        <a:srgbClr val="1A1A1A"/>
       </a:accent1>
       <a:accent2>
         <a:srgbClr val="C0504D"/>
@@ -26419,16 +26475,16 @@
         <a:srgbClr val="9BBB59"/>
       </a:accent3>
       <a:accent4>
-        <a:srgbClr val="8064A2"/>
+        <a:srgbClr val="1A1A1A"/>
       </a:accent4>
       <a:accent5>
-        <a:srgbClr val="4BACC6"/>
+        <a:srgbClr val="1A1A1A"/>
       </a:accent5>
       <a:accent6>
         <a:srgbClr val="F79646"/>
       </a:accent6>
       <a:hlink>
-        <a:srgbClr val="0000FF"/>
+        <a:srgbClr val="1A1A1A"/>
       </a:hlink>
       <a:folHlink>
         <a:srgbClr val="800080"/>

</xml_diff>